<commit_message>
java week09 and data tcp week09
</commit_message>
<xml_diff>
--- a/데이터 통신/데이터통신 7주차 과제.docx
+++ b/데이터 통신/데이터통신 7주차 과제.docx
@@ -103,43 +103,39 @@
           <w:sz w:val="44"/>
           <w:szCs w:val="44"/>
         </w:rPr>
-        <w:t>-</w:t>
-      </w:r>
-      <w:proofErr w:type="gramStart"/>
-      <w:r>
-        <w:rPr>
-          <w:rFonts w:hint="eastAsia"/>
+        <w:t>-이름:이지형</w:t>
+      </w:r>
+    </w:p>
+    <w:p>
+      <w:pPr>
+        <w:rPr>
           <w:b/>
           <w:bCs/>
           <w:sz w:val="44"/>
           <w:szCs w:val="44"/>
         </w:rPr>
-        <w:t>이름:이지형</w:t>
-      </w:r>
-      <w:proofErr w:type="gramEnd"/>
-    </w:p>
-    <w:p>
-      <w:pPr>
-        <w:rPr>
+      </w:pPr>
+      <w:r>
+        <w:rPr>
+          <w:rFonts w:hint="eastAsia"/>
           <w:b/>
           <w:bCs/>
           <w:sz w:val="44"/>
           <w:szCs w:val="44"/>
         </w:rPr>
-      </w:pPr>
-      <w:r>
-        <w:rPr>
-          <w:rFonts w:hint="eastAsia"/>
+        <w:t>-트랙: 빅데이터&amp;모바일소프트웨어</w:t>
+      </w:r>
+    </w:p>
+    <w:p>
+      <w:pPr>
+        <w:rPr>
           <w:b/>
           <w:bCs/>
           <w:sz w:val="44"/>
           <w:szCs w:val="44"/>
         </w:rPr>
-        <w:t>-트랙: 빅데이터&amp;모바일소프트웨어</w:t>
-      </w:r>
-    </w:p>
-    <w:p>
-      <w:pPr>
+      </w:pPr>
+      <w:r>
         <w:rPr>
           <w:rFonts w:hint="eastAsia"/>
           <w:b/>
@@ -147,15 +143,6 @@
           <w:sz w:val="44"/>
           <w:szCs w:val="44"/>
         </w:rPr>
-      </w:pPr>
-      <w:r>
-        <w:rPr>
-          <w:rFonts w:hint="eastAsia"/>
-          <w:b/>
-          <w:bCs/>
-          <w:sz w:val="44"/>
-          <w:szCs w:val="44"/>
-        </w:rPr>
         <w:t>-분반: 데이터통신B반</w:t>
       </w:r>
     </w:p>
@@ -192,7 +179,6 @@
     <w:p>
       <w:pPr>
         <w:rPr>
-          <w:rFonts w:hint="eastAsia"/>
           <w:b/>
           <w:bCs/>
           <w:sz w:val="32"/>
@@ -224,35 +210,16 @@
           <w:bCs/>
           <w:szCs w:val="22"/>
         </w:rPr>
-        <w:t xml:space="preserve">2장 7절 내용을 참조하여, 'echo' client-server 프로그램을 </w:t>
-      </w:r>
-      <w:proofErr w:type="gramStart"/>
-      <w:r>
-        <w:rPr>
-          <w:b/>
-          <w:bCs/>
-          <w:szCs w:val="22"/>
-        </w:rPr>
-        <w:t xml:space="preserve">구현하고, </w:t>
-      </w:r>
-      <w:r>
-        <w:rPr>
-          <w:rFonts w:hint="eastAsia"/>
-          <w:b/>
-          <w:bCs/>
-          <w:szCs w:val="22"/>
-        </w:rPr>
-        <w:t xml:space="preserve">  </w:t>
-      </w:r>
-      <w:proofErr w:type="gramEnd"/>
-      <w:r>
-        <w:rPr>
-          <w:rFonts w:hint="eastAsia"/>
-          <w:b/>
-          <w:bCs/>
-          <w:szCs w:val="22"/>
-        </w:rPr>
-        <w:t xml:space="preserve">              </w:t>
+        <w:t xml:space="preserve">2장 7절 내용을 참조하여, 'echo' client-server 프로그램을 구현하고, </w:t>
+      </w:r>
+      <w:r>
+        <w:rPr>
+          <w:rFonts w:hint="eastAsia"/>
+          <w:b/>
+          <w:bCs/>
+          <w:szCs w:val="22"/>
+        </w:rPr>
+        <w:t xml:space="preserve">                </w:t>
       </w:r>
       <w:r>
         <w:rPr>
@@ -347,12 +314,3290 @@
     <w:p>
       <w:pPr>
         <w:rPr>
-          <w:rFonts w:hint="eastAsia"/>
-          <w:b/>
-          <w:bCs/>
-          <w:szCs w:val="22"/>
-        </w:rPr>
-      </w:pPr>
+          <w:b/>
+          <w:bCs/>
+          <w:szCs w:val="22"/>
+        </w:rPr>
+      </w:pPr>
+      <w:r>
+        <w:rPr>
+          <w:b/>
+          <w:bCs/>
+          <w:szCs w:val="22"/>
+        </w:rPr>
+        <w:t xml:space="preserve">from socket import * </w:t>
+      </w:r>
+    </w:p>
+    <w:p>
+      <w:pPr>
+        <w:rPr>
+          <w:b/>
+          <w:bCs/>
+          <w:szCs w:val="22"/>
+        </w:rPr>
+      </w:pPr>
+      <w:r>
+        <w:rPr>
+          <w:b/>
+          <w:bCs/>
+          <w:szCs w:val="22"/>
+        </w:rPr>
+        <w:t xml:space="preserve">student_id = "2371214" </w:t>
+      </w:r>
+    </w:p>
+    <w:p>
+      <w:pPr>
+        <w:rPr>
+          <w:b/>
+          <w:bCs/>
+          <w:szCs w:val="22"/>
+        </w:rPr>
+      </w:pPr>
+      <w:r>
+        <w:rPr>
+          <w:b/>
+          <w:bCs/>
+          <w:szCs w:val="22"/>
+        </w:rPr>
+        <w:t>student_name = "이 지 형 "</w:t>
+      </w:r>
+    </w:p>
+    <w:p>
+      <w:pPr>
+        <w:rPr>
+          <w:b/>
+          <w:bCs/>
+          <w:szCs w:val="22"/>
+        </w:rPr>
+      </w:pPr>
+    </w:p>
+    <w:p>
+      <w:pPr>
+        <w:rPr>
+          <w:b/>
+          <w:bCs/>
+          <w:szCs w:val="22"/>
+        </w:rPr>
+      </w:pPr>
+      <w:r>
+        <w:rPr>
+          <w:b/>
+          <w:bCs/>
+          <w:szCs w:val="22"/>
+        </w:rPr>
+        <w:t xml:space="preserve"> # 서버 포트 설정 </w:t>
+      </w:r>
+    </w:p>
+    <w:p>
+      <w:pPr>
+        <w:rPr>
+          <w:b/>
+          <w:bCs/>
+          <w:szCs w:val="22"/>
+        </w:rPr>
+      </w:pPr>
+      <w:r>
+        <w:rPr>
+          <w:b/>
+          <w:bCs/>
+          <w:szCs w:val="22"/>
+        </w:rPr>
+        <w:t xml:space="preserve">serverPort = 12000 </w:t>
+      </w:r>
+    </w:p>
+    <w:p>
+      <w:pPr>
+        <w:rPr>
+          <w:b/>
+          <w:bCs/>
+          <w:szCs w:val="22"/>
+        </w:rPr>
+      </w:pPr>
+      <w:r>
+        <w:rPr>
+          <w:b/>
+          <w:bCs/>
+          <w:szCs w:val="22"/>
+        </w:rPr>
+        <w:t xml:space="preserve"># UDP 소켓 생성 및 포트 바인딩 </w:t>
+      </w:r>
+    </w:p>
+    <w:p>
+      <w:pPr>
+        <w:rPr>
+          <w:b/>
+          <w:bCs/>
+          <w:szCs w:val="22"/>
+        </w:rPr>
+      </w:pPr>
+      <w:r>
+        <w:rPr>
+          <w:b/>
+          <w:bCs/>
+          <w:szCs w:val="22"/>
+        </w:rPr>
+        <w:t xml:space="preserve">serverSocket = socket(AF_INET, SOCK_DGRAM) </w:t>
+      </w:r>
+    </w:p>
+    <w:p>
+      <w:pPr>
+        <w:rPr>
+          <w:b/>
+          <w:bCs/>
+          <w:szCs w:val="22"/>
+        </w:rPr>
+      </w:pPr>
+      <w:r>
+        <w:rPr>
+          <w:b/>
+          <w:bCs/>
+          <w:szCs w:val="22"/>
+        </w:rPr>
+        <w:t xml:space="preserve">serverSocket.bind(('', serverPort)) print(f"==========================================") </w:t>
+      </w:r>
+    </w:p>
+    <w:p>
+      <w:pPr>
+        <w:rPr>
+          <w:b/>
+          <w:bCs/>
+          <w:szCs w:val="22"/>
+        </w:rPr>
+      </w:pPr>
+      <w:r>
+        <w:rPr>
+          <w:b/>
+          <w:bCs/>
+          <w:szCs w:val="22"/>
+        </w:rPr>
+        <w:t xml:space="preserve">print(f" UDP Server Started by [{student_id} {student_name}]") </w:t>
+      </w:r>
+    </w:p>
+    <w:p>
+      <w:pPr>
+        <w:rPr>
+          <w:b/>
+          <w:bCs/>
+          <w:szCs w:val="22"/>
+        </w:rPr>
+      </w:pPr>
+      <w:r>
+        <w:rPr>
+          <w:b/>
+          <w:bCs/>
+          <w:szCs w:val="22"/>
+        </w:rPr>
+        <w:t xml:space="preserve">print(f" The server is ready to receive (Port: {serverPort})") print(f"==========================================\n") </w:t>
+      </w:r>
+    </w:p>
+    <w:p>
+      <w:pPr>
+        <w:rPr>
+          <w:b/>
+          <w:bCs/>
+          <w:szCs w:val="22"/>
+        </w:rPr>
+      </w:pPr>
+      <w:r>
+        <w:rPr>
+          <w:b/>
+          <w:bCs/>
+          <w:szCs w:val="22"/>
+        </w:rPr>
+        <w:t xml:space="preserve">while True: </w:t>
+      </w:r>
+    </w:p>
+    <w:p>
+      <w:pPr>
+        <w:ind w:firstLine="800"/>
+        <w:rPr>
+          <w:b/>
+          <w:bCs/>
+          <w:szCs w:val="22"/>
+        </w:rPr>
+      </w:pPr>
+      <w:r>
+        <w:rPr>
+          <w:b/>
+          <w:bCs/>
+          <w:szCs w:val="22"/>
+        </w:rPr>
+        <w:t xml:space="preserve"># 데이터 및 클라이언트 주소 수신 </w:t>
+      </w:r>
+    </w:p>
+    <w:p>
+      <w:pPr>
+        <w:ind w:firstLine="800"/>
+        <w:rPr>
+          <w:b/>
+          <w:bCs/>
+          <w:szCs w:val="22"/>
+        </w:rPr>
+      </w:pPr>
+      <w:r>
+        <w:rPr>
+          <w:b/>
+          <w:bCs/>
+          <w:szCs w:val="22"/>
+        </w:rPr>
+        <w:t xml:space="preserve">message, clientAddress = serverSocket.recvfrom(2048) </w:t>
+      </w:r>
+    </w:p>
+    <w:p>
+      <w:pPr>
+        <w:ind w:firstLine="800"/>
+        <w:rPr>
+          <w:b/>
+          <w:bCs/>
+          <w:szCs w:val="22"/>
+        </w:rPr>
+      </w:pPr>
+      <w:r>
+        <w:rPr>
+          <w:b/>
+          <w:bCs/>
+          <w:szCs w:val="22"/>
+        </w:rPr>
+        <w:t xml:space="preserve"># 수신한 데이터 디코딩 후 출력 </w:t>
+      </w:r>
+    </w:p>
+    <w:p>
+      <w:pPr>
+        <w:ind w:firstLine="800"/>
+        <w:rPr>
+          <w:b/>
+          <w:bCs/>
+          <w:szCs w:val="22"/>
+        </w:rPr>
+      </w:pPr>
+      <w:r>
+        <w:rPr>
+          <w:b/>
+          <w:bCs/>
+          <w:szCs w:val="22"/>
+        </w:rPr>
+        <w:t xml:space="preserve">decoded_message = message.decode() </w:t>
+      </w:r>
+    </w:p>
+    <w:p>
+      <w:pPr>
+        <w:ind w:left="800"/>
+        <w:rPr>
+          <w:b/>
+          <w:bCs/>
+          <w:szCs w:val="22"/>
+        </w:rPr>
+      </w:pPr>
+      <w:r>
+        <w:rPr>
+          <w:b/>
+          <w:bCs/>
+          <w:szCs w:val="22"/>
+        </w:rPr>
+        <w:t>print(f"[Received from {clientAddress}]: {decoded_message}") modifiedMessage = decoded_message.upper() serverSocket.sendto(modifiedMessage.encode(), clientAddress)</w:t>
+      </w:r>
+    </w:p>
+    <w:p>
+      <w:pPr>
+        <w:rPr>
+          <w:b/>
+          <w:bCs/>
+          <w:szCs w:val="22"/>
+        </w:rPr>
+      </w:pPr>
+    </w:p>
+    <w:p>
+      <w:pPr>
+        <w:rPr>
+          <w:b/>
+          <w:bCs/>
+          <w:szCs w:val="22"/>
+        </w:rPr>
+      </w:pPr>
+    </w:p>
+    <w:p>
+      <w:pPr>
+        <w:rPr>
+          <w:b/>
+          <w:bCs/>
+          <w:szCs w:val="22"/>
+        </w:rPr>
+      </w:pPr>
+    </w:p>
+    <w:p>
+      <w:pPr>
+        <w:rPr>
+          <w:b/>
+          <w:bCs/>
+          <w:szCs w:val="22"/>
+        </w:rPr>
+      </w:pPr>
+    </w:p>
+    <w:p>
+      <w:pPr>
+        <w:rPr>
+          <w:b/>
+          <w:bCs/>
+          <w:szCs w:val="22"/>
+        </w:rPr>
+      </w:pPr>
+      <w:r>
+        <w:rPr>
+          <w:rFonts w:hint="eastAsia"/>
+          <w:b/>
+          <w:bCs/>
+          <w:szCs w:val="22"/>
+        </w:rPr>
+        <w:lastRenderedPageBreak/>
+        <w:t>1-2.UDP_client.py 소스코드 제출</w:t>
+      </w:r>
+    </w:p>
+    <w:p>
+      <w:pPr>
+        <w:rPr>
+          <w:b/>
+          <w:bCs/>
+          <w:szCs w:val="22"/>
+        </w:rPr>
+      </w:pPr>
+      <w:r>
+        <w:rPr>
+          <w:b/>
+          <w:bCs/>
+          <w:szCs w:val="22"/>
+        </w:rPr>
+        <w:t>from socket import *</w:t>
+      </w:r>
+    </w:p>
+    <w:p>
+      <w:pPr>
+        <w:rPr>
+          <w:b/>
+          <w:bCs/>
+          <w:szCs w:val="22"/>
+        </w:rPr>
+      </w:pPr>
+    </w:p>
+    <w:p>
+      <w:pPr>
+        <w:rPr>
+          <w:b/>
+          <w:bCs/>
+          <w:szCs w:val="22"/>
+        </w:rPr>
+      </w:pPr>
+      <w:r>
+        <w:rPr>
+          <w:b/>
+          <w:bCs/>
+          <w:szCs w:val="22"/>
+        </w:rPr>
+        <w:t>student_id = "2371214"</w:t>
+      </w:r>
+    </w:p>
+    <w:p>
+      <w:pPr>
+        <w:rPr>
+          <w:b/>
+          <w:bCs/>
+          <w:szCs w:val="22"/>
+        </w:rPr>
+      </w:pPr>
+      <w:r>
+        <w:rPr>
+          <w:b/>
+          <w:bCs/>
+          <w:szCs w:val="22"/>
+        </w:rPr>
+        <w:t>student_name = "이 지 형 "</w:t>
+      </w:r>
+    </w:p>
+    <w:p>
+      <w:pPr>
+        <w:rPr>
+          <w:b/>
+          <w:bCs/>
+          <w:szCs w:val="22"/>
+        </w:rPr>
+      </w:pPr>
+      <w:r>
+        <w:rPr>
+          <w:b/>
+          <w:bCs/>
+          <w:szCs w:val="22"/>
+        </w:rPr>
+        <w:t>serverName = '127.0.0.1'</w:t>
+      </w:r>
+    </w:p>
+    <w:p>
+      <w:pPr>
+        <w:rPr>
+          <w:b/>
+          <w:bCs/>
+          <w:szCs w:val="22"/>
+        </w:rPr>
+      </w:pPr>
+      <w:r>
+        <w:rPr>
+          <w:b/>
+          <w:bCs/>
+          <w:szCs w:val="22"/>
+        </w:rPr>
+        <w:t>serverPort = 12000</w:t>
+      </w:r>
+    </w:p>
+    <w:p>
+      <w:pPr>
+        <w:rPr>
+          <w:b/>
+          <w:bCs/>
+          <w:szCs w:val="22"/>
+        </w:rPr>
+      </w:pPr>
+    </w:p>
+    <w:p>
+      <w:pPr>
+        <w:rPr>
+          <w:b/>
+          <w:bCs/>
+          <w:szCs w:val="22"/>
+        </w:rPr>
+      </w:pPr>
+      <w:r>
+        <w:rPr>
+          <w:b/>
+          <w:bCs/>
+          <w:szCs w:val="22"/>
+        </w:rPr>
+        <w:t>clientSocket = socket(AF_INET, SOCK_DGRAM)</w:t>
+      </w:r>
+    </w:p>
+    <w:p>
+      <w:pPr>
+        <w:rPr>
+          <w:b/>
+          <w:bCs/>
+          <w:szCs w:val="22"/>
+        </w:rPr>
+      </w:pPr>
+    </w:p>
+    <w:p>
+      <w:pPr>
+        <w:rPr>
+          <w:b/>
+          <w:bCs/>
+          <w:szCs w:val="22"/>
+        </w:rPr>
+      </w:pPr>
+      <w:r>
+        <w:rPr>
+          <w:b/>
+          <w:bCs/>
+          <w:szCs w:val="22"/>
+        </w:rPr>
+        <w:t>print("==========================================")</w:t>
+      </w:r>
+    </w:p>
+    <w:p>
+      <w:pPr>
+        <w:rPr>
+          <w:b/>
+          <w:bCs/>
+          <w:szCs w:val="22"/>
+        </w:rPr>
+      </w:pPr>
+      <w:r>
+        <w:rPr>
+          <w:b/>
+          <w:bCs/>
+          <w:szCs w:val="22"/>
+        </w:rPr>
+        <w:t>print(f" UDP Client Running [{student_id} {student_name}]")</w:t>
+      </w:r>
+    </w:p>
+    <w:p>
+      <w:pPr>
+        <w:rPr>
+          <w:b/>
+          <w:bCs/>
+          <w:szCs w:val="22"/>
+        </w:rPr>
+      </w:pPr>
+      <w:r>
+        <w:rPr>
+          <w:b/>
+          <w:bCs/>
+          <w:szCs w:val="22"/>
+        </w:rPr>
+        <w:t>print(" (종 료 하 려 면  'q' 또는  'exit'를  입 력 하 세 요 )")</w:t>
+      </w:r>
+    </w:p>
+    <w:p>
+      <w:pPr>
+        <w:rPr>
+          <w:rFonts w:hint="eastAsia"/>
+          <w:b/>
+          <w:bCs/>
+          <w:szCs w:val="22"/>
+        </w:rPr>
+      </w:pPr>
+      <w:r>
+        <w:rPr>
+          <w:b/>
+          <w:bCs/>
+          <w:szCs w:val="22"/>
+        </w:rPr>
+        <w:t>print("==========================================\n")</w:t>
+      </w:r>
+    </w:p>
+    <w:p>
+      <w:pPr>
+        <w:rPr>
+          <w:b/>
+          <w:bCs/>
+          <w:szCs w:val="22"/>
+        </w:rPr>
+      </w:pPr>
+      <w:r>
+        <w:rPr>
+          <w:b/>
+          <w:bCs/>
+          <w:szCs w:val="22"/>
+        </w:rPr>
+        <w:t>while True:</w:t>
+      </w:r>
+    </w:p>
+    <w:p>
+      <w:pPr>
+        <w:rPr>
+          <w:rFonts w:hint="eastAsia"/>
+          <w:b/>
+          <w:bCs/>
+          <w:szCs w:val="22"/>
+        </w:rPr>
+      </w:pPr>
+      <w:r>
+        <w:rPr>
+          <w:b/>
+          <w:bCs/>
+          <w:szCs w:val="22"/>
+        </w:rPr>
+        <w:t xml:space="preserve">    message = input("Input lowercase sentence: ")</w:t>
+      </w:r>
+    </w:p>
+    <w:p>
+      <w:pPr>
+        <w:rPr>
+          <w:b/>
+          <w:bCs/>
+          <w:szCs w:val="22"/>
+        </w:rPr>
+      </w:pPr>
+      <w:r>
+        <w:rPr>
+          <w:b/>
+          <w:bCs/>
+          <w:szCs w:val="22"/>
+        </w:rPr>
+        <w:t xml:space="preserve">    if message.lower() in ['q', 'exit']:</w:t>
+      </w:r>
+    </w:p>
+    <w:p>
+      <w:pPr>
+        <w:rPr>
+          <w:b/>
+          <w:bCs/>
+          <w:szCs w:val="22"/>
+        </w:rPr>
+      </w:pPr>
+      <w:r>
+        <w:rPr>
+          <w:b/>
+          <w:bCs/>
+          <w:szCs w:val="22"/>
+        </w:rPr>
+        <w:t xml:space="preserve">        print("\n[Client] 통 신 을  종 료 합 니 다 .")</w:t>
+      </w:r>
+    </w:p>
+    <w:p>
+      <w:pPr>
+        <w:rPr>
+          <w:rFonts w:hint="eastAsia"/>
+          <w:b/>
+          <w:bCs/>
+          <w:szCs w:val="22"/>
+        </w:rPr>
+      </w:pPr>
+      <w:r>
+        <w:rPr>
+          <w:b/>
+          <w:bCs/>
+          <w:szCs w:val="22"/>
+        </w:rPr>
+        <w:t xml:space="preserve">        break</w:t>
+      </w:r>
+    </w:p>
+    <w:p>
+      <w:pPr>
+        <w:rPr>
+          <w:b/>
+          <w:bCs/>
+          <w:szCs w:val="22"/>
+        </w:rPr>
+      </w:pPr>
+      <w:r>
+        <w:rPr>
+          <w:b/>
+          <w:bCs/>
+          <w:szCs w:val="22"/>
+        </w:rPr>
+        <w:t xml:space="preserve">    full_message = f"[{student_id} {student_name}] {message}"</w:t>
+      </w:r>
+    </w:p>
+    <w:p>
+      <w:pPr>
+        <w:rPr>
+          <w:rFonts w:hint="eastAsia"/>
+          <w:b/>
+          <w:bCs/>
+          <w:szCs w:val="22"/>
+        </w:rPr>
+      </w:pPr>
+      <w:r>
+        <w:rPr>
+          <w:b/>
+          <w:bCs/>
+          <w:szCs w:val="22"/>
+        </w:rPr>
+        <w:t xml:space="preserve">    clientSocket.sendto(full_message.encode(), (serverName, serverPort))</w:t>
+      </w:r>
+    </w:p>
+    <w:p>
+      <w:pPr>
+        <w:rPr>
+          <w:rFonts w:hint="eastAsia"/>
+          <w:b/>
+          <w:bCs/>
+          <w:szCs w:val="22"/>
+        </w:rPr>
+      </w:pPr>
+      <w:r>
+        <w:rPr>
+          <w:b/>
+          <w:bCs/>
+          <w:szCs w:val="22"/>
+        </w:rPr>
+        <w:t xml:space="preserve">    modifiedMessage, serverAddress = clientSocket.recvfrom(2048)</w:t>
+      </w:r>
+    </w:p>
+    <w:p>
+      <w:pPr>
+        <w:rPr>
+          <w:b/>
+          <w:bCs/>
+          <w:szCs w:val="22"/>
+        </w:rPr>
+      </w:pPr>
+      <w:r>
+        <w:rPr>
+          <w:b/>
+          <w:bCs/>
+          <w:szCs w:val="22"/>
+        </w:rPr>
+        <w:t xml:space="preserve">    print(f"From Server: {modifiedMessage.decode()}\n")</w:t>
+      </w:r>
+    </w:p>
+    <w:p>
+      <w:pPr>
+        <w:rPr>
+          <w:b/>
+          <w:bCs/>
+          <w:szCs w:val="22"/>
+        </w:rPr>
+      </w:pPr>
+    </w:p>
+    <w:p>
+      <w:pPr>
+        <w:rPr>
+          <w:b/>
+          <w:bCs/>
+          <w:szCs w:val="22"/>
+        </w:rPr>
+      </w:pPr>
+      <w:r>
+        <w:rPr>
+          <w:b/>
+          <w:bCs/>
+          <w:szCs w:val="22"/>
+        </w:rPr>
+        <w:t>clientSocket.close()</w:t>
+      </w:r>
+    </w:p>
+    <w:p>
+      <w:pPr>
+        <w:rPr>
+          <w:b/>
+          <w:bCs/>
+          <w:szCs w:val="22"/>
+        </w:rPr>
+      </w:pPr>
+      <w:r>
+        <w:rPr>
+          <w:rFonts w:hint="eastAsia"/>
+          <w:b/>
+          <w:bCs/>
+          <w:szCs w:val="22"/>
+        </w:rPr>
+        <w:lastRenderedPageBreak/>
+        <w:t>1-3. UDP client-server프로그램 실행결과</w:t>
+      </w:r>
+    </w:p>
+    <w:p>
+      <w:pPr>
+        <w:rPr>
+          <w:b/>
+          <w:bCs/>
+          <w:szCs w:val="22"/>
+        </w:rPr>
+      </w:pPr>
+      <w:r>
+        <w:rPr>
+          <w:b/>
+          <w:bCs/>
+          <w:szCs w:val="22"/>
+        </w:rPr>
+        <w:drawing>
+          <wp:inline distT="0" distB="0" distL="0" distR="0" wp14:anchorId="56B14454" wp14:editId="2175ECBC">
+            <wp:extent cx="5731510" cy="3134360"/>
+            <wp:effectExtent l="0" t="0" r="2540" b="8890"/>
+            <wp:docPr id="805127590" name="그림 1"/>
+            <wp:cNvGraphicFramePr>
+              <a:graphicFrameLocks xmlns:a="http://schemas.openxmlformats.org/drawingml/2006/main" noChangeAspect="1"/>
+            </wp:cNvGraphicFramePr>
+            <a:graphic xmlns:a="http://schemas.openxmlformats.org/drawingml/2006/main">
+              <a:graphicData uri="http://schemas.openxmlformats.org/drawingml/2006/picture">
+                <pic:pic xmlns:pic="http://schemas.openxmlformats.org/drawingml/2006/picture">
+                  <pic:nvPicPr>
+                    <pic:cNvPr id="805127590" name=""/>
+                    <pic:cNvPicPr/>
+                  </pic:nvPicPr>
+                  <pic:blipFill>
+                    <a:blip r:embed="rId5"/>
+                    <a:stretch>
+                      <a:fillRect/>
+                    </a:stretch>
+                  </pic:blipFill>
+                  <pic:spPr>
+                    <a:xfrm>
+                      <a:off x="0" y="0"/>
+                      <a:ext cx="5731510" cy="3134360"/>
+                    </a:xfrm>
+                    <a:prstGeom prst="rect">
+                      <a:avLst/>
+                    </a:prstGeom>
+                  </pic:spPr>
+                </pic:pic>
+              </a:graphicData>
+            </a:graphic>
+          </wp:inline>
+        </w:drawing>
+      </w:r>
+    </w:p>
+    <w:p>
+      <w:pPr>
+        <w:rPr>
+          <w:b/>
+          <w:bCs/>
+          <w:szCs w:val="22"/>
+        </w:rPr>
+      </w:pPr>
+      <w:r>
+        <w:rPr>
+          <w:b/>
+          <w:bCs/>
+          <w:szCs w:val="22"/>
+        </w:rPr>
+        <w:drawing>
+          <wp:inline distT="0" distB="0" distL="0" distR="0" wp14:anchorId="4CA13BF0" wp14:editId="15430576">
+            <wp:extent cx="5731510" cy="1552575"/>
+            <wp:effectExtent l="0" t="0" r="2540" b="9525"/>
+            <wp:docPr id="2064349981" name="그림 1"/>
+            <wp:cNvGraphicFramePr>
+              <a:graphicFrameLocks xmlns:a="http://schemas.openxmlformats.org/drawingml/2006/main" noChangeAspect="1"/>
+            </wp:cNvGraphicFramePr>
+            <a:graphic xmlns:a="http://schemas.openxmlformats.org/drawingml/2006/main">
+              <a:graphicData uri="http://schemas.openxmlformats.org/drawingml/2006/picture">
+                <pic:pic xmlns:pic="http://schemas.openxmlformats.org/drawingml/2006/picture">
+                  <pic:nvPicPr>
+                    <pic:cNvPr id="2064349981" name=""/>
+                    <pic:cNvPicPr/>
+                  </pic:nvPicPr>
+                  <pic:blipFill>
+                    <a:blip r:embed="rId6"/>
+                    <a:stretch>
+                      <a:fillRect/>
+                    </a:stretch>
+                  </pic:blipFill>
+                  <pic:spPr>
+                    <a:xfrm>
+                      <a:off x="0" y="0"/>
+                      <a:ext cx="5731510" cy="1552575"/>
+                    </a:xfrm>
+                    <a:prstGeom prst="rect">
+                      <a:avLst/>
+                    </a:prstGeom>
+                  </pic:spPr>
+                </pic:pic>
+              </a:graphicData>
+            </a:graphic>
+          </wp:inline>
+        </w:drawing>
+      </w:r>
+    </w:p>
+    <w:p>
+      <w:pPr>
+        <w:rPr>
+          <w:b/>
+          <w:bCs/>
+          <w:szCs w:val="22"/>
+        </w:rPr>
+      </w:pPr>
+      <w:r>
+        <w:rPr>
+          <w:rFonts w:hint="eastAsia"/>
+          <w:b/>
+          <w:bCs/>
+          <w:szCs w:val="22"/>
+        </w:rPr>
+        <w:t>1-4.</w:t>
+      </w:r>
+      <w:r>
+        <w:rPr>
+          <w:rFonts w:hint="eastAsia"/>
+          <w:b/>
+          <w:bCs/>
+          <w:szCs w:val="22"/>
+        </w:rPr>
+        <w:t>UDP</w:t>
+      </w:r>
+      <w:r>
+        <w:rPr>
+          <w:rFonts w:hint="eastAsia"/>
+          <w:b/>
+          <w:bCs/>
+          <w:szCs w:val="22"/>
+        </w:rPr>
+        <w:t>프로그램 설명</w:t>
+      </w:r>
+    </w:p>
+    <w:p>
+      <w:pPr>
+        <w:rPr>
+          <w:b/>
+          <w:bCs/>
+          <w:szCs w:val="22"/>
+        </w:rPr>
+      </w:pPr>
+      <w:r>
+        <w:rPr>
+          <w:rFonts w:hint="eastAsia"/>
+          <w:b/>
+          <w:bCs/>
+          <w:szCs w:val="22"/>
+        </w:rPr>
+        <w:t>-</w:t>
+      </w:r>
+      <w:r>
+        <w:rPr>
+          <w:rFonts w:hint="eastAsia"/>
+          <w:b/>
+          <w:bCs/>
+          <w:szCs w:val="22"/>
+        </w:rPr>
+        <w:t xml:space="preserve">UDP는 TCP와 달리 연결설정과정이 없는 비연결형 프로토콜로, 데이터 전송 신뢰성 보다는 신속한 </w:t>
+      </w:r>
+      <w:proofErr w:type="spellStart"/>
+      <w:r>
+        <w:rPr>
+          <w:rFonts w:hint="eastAsia"/>
+          <w:b/>
+          <w:bCs/>
+          <w:szCs w:val="22"/>
+        </w:rPr>
+        <w:t>패킷전달에</w:t>
+      </w:r>
+      <w:proofErr w:type="spellEnd"/>
+      <w:r>
+        <w:rPr>
+          <w:rFonts w:hint="eastAsia"/>
+          <w:b/>
+          <w:bCs/>
+          <w:szCs w:val="22"/>
+        </w:rPr>
+        <w:t xml:space="preserve"> 목적을 둡니다. 해당 프로그래밍 과제는 클라이언트가 입력한 소문자 문자열을 서버로 전송하면, 서버가 이를 대문자로 변환 하여 클라이언트에게 다시 반환하도록 설계 하였으며, 데이터통신 2장-7절의 PDF강의 자료를 참고하여 제작하였습니다.</w:t>
+      </w:r>
+    </w:p>
+    <w:p>
+      <w:pPr>
+        <w:rPr>
+          <w:b/>
+          <w:bCs/>
+          <w:szCs w:val="22"/>
+        </w:rPr>
+      </w:pPr>
+    </w:p>
+    <w:p>
+      <w:pPr>
+        <w:rPr>
+          <w:b/>
+          <w:bCs/>
+          <w:szCs w:val="22"/>
+        </w:rPr>
+      </w:pPr>
+      <w:r>
+        <w:rPr>
+          <w:rFonts w:hint="eastAsia"/>
+          <w:b/>
+          <w:bCs/>
+          <w:szCs w:val="22"/>
+        </w:rPr>
+        <w:t>-</w:t>
+      </w:r>
+      <w:r>
+        <w:rPr>
+          <w:b/>
+          <w:bCs/>
+          <w:szCs w:val="22"/>
+        </w:rPr>
+        <w:t>socket(AF_INET, SOCK_DGRAM)</w:t>
+      </w:r>
+      <w:r>
+        <w:rPr>
+          <w:rFonts w:hint="eastAsia"/>
+          <w:b/>
+          <w:bCs/>
+          <w:szCs w:val="22"/>
+        </w:rPr>
+        <w:t xml:space="preserve">: </w:t>
+      </w:r>
+      <w:r>
+        <w:rPr>
+          <w:b/>
+          <w:bCs/>
+          <w:szCs w:val="22"/>
+        </w:rPr>
+        <w:t>IPv4 주소 체계와 UDP프로토콜을 사용하는 소켓을 생성</w:t>
+      </w:r>
+      <w:r>
+        <w:rPr>
+          <w:rFonts w:hint="eastAsia"/>
+          <w:b/>
+          <w:bCs/>
+          <w:szCs w:val="22"/>
+        </w:rPr>
+        <w:t>합니다.</w:t>
+      </w:r>
+    </w:p>
+    <w:p>
+      <w:pPr>
+        <w:rPr>
+          <w:b/>
+          <w:bCs/>
+          <w:szCs w:val="22"/>
+        </w:rPr>
+      </w:pPr>
+    </w:p>
+    <w:p>
+      <w:pPr>
+        <w:rPr>
+          <w:b/>
+          <w:bCs/>
+          <w:szCs w:val="22"/>
+        </w:rPr>
+      </w:pPr>
+      <w:r>
+        <w:rPr>
+          <w:rFonts w:hint="eastAsia"/>
+          <w:b/>
+          <w:bCs/>
+          <w:szCs w:val="22"/>
+        </w:rPr>
+        <w:t>-</w:t>
+      </w:r>
+      <w:r>
+        <w:rPr>
+          <w:b/>
+          <w:bCs/>
+          <w:szCs w:val="22"/>
+        </w:rPr>
+        <w:t>serverSocket.bind(('', serverPort))를 통해 서버가 클라이언트의 접속을 받아들일 포트 번호(12000)를 명시적으로 바인딩</w:t>
+      </w:r>
+      <w:r>
+        <w:rPr>
+          <w:rFonts w:hint="eastAsia"/>
+          <w:b/>
+          <w:bCs/>
+          <w:szCs w:val="22"/>
+        </w:rPr>
+        <w:t>합니다.</w:t>
+      </w:r>
+    </w:p>
+    <w:p>
+      <w:pPr>
+        <w:rPr>
+          <w:b/>
+          <w:bCs/>
+          <w:szCs w:val="22"/>
+        </w:rPr>
+      </w:pPr>
+      <w:r>
+        <w:rPr>
+          <w:rFonts w:hint="eastAsia"/>
+          <w:b/>
+          <w:bCs/>
+          <w:szCs w:val="22"/>
+        </w:rPr>
+        <w:lastRenderedPageBreak/>
+        <w:t>-</w:t>
+      </w:r>
+      <w:r>
+        <w:rPr>
+          <w:b/>
+          <w:bCs/>
+          <w:szCs w:val="22"/>
+        </w:rPr>
+        <w:t>while True</w:t>
+      </w:r>
+      <w:r>
+        <w:rPr>
+          <w:rFonts w:hint="eastAsia"/>
+          <w:b/>
+          <w:bCs/>
+          <w:szCs w:val="22"/>
+        </w:rPr>
+        <w:t xml:space="preserve"> </w:t>
+      </w:r>
+      <w:r>
+        <w:rPr>
+          <w:b/>
+          <w:bCs/>
+          <w:szCs w:val="22"/>
+        </w:rPr>
+        <w:t>무한 루프를 통해 서버 프로세스가 종료되지 않고 계속해서 요청을 받을 수 있도록 가동 상태를 유지</w:t>
+      </w:r>
+      <w:r>
+        <w:rPr>
+          <w:rFonts w:hint="eastAsia"/>
+          <w:b/>
+          <w:bCs/>
+          <w:szCs w:val="22"/>
+        </w:rPr>
+        <w:t xml:space="preserve">하며.  </w:t>
+      </w:r>
+      <w:r>
+        <w:rPr>
+          <w:b/>
+          <w:bCs/>
+          <w:szCs w:val="22"/>
+        </w:rPr>
+        <w:t xml:space="preserve">serverSocket.recvfrom(2048)을 사용하여 최대 2048 Byte 크기의 버퍼로부터 </w:t>
+      </w:r>
+      <w:proofErr w:type="spellStart"/>
+      <w:r>
+        <w:rPr>
+          <w:b/>
+          <w:bCs/>
+          <w:szCs w:val="22"/>
+        </w:rPr>
+        <w:t>데이터그램</w:t>
+      </w:r>
+      <w:proofErr w:type="spellEnd"/>
+      <w:r>
+        <w:rPr>
+          <w:b/>
+          <w:bCs/>
+          <w:szCs w:val="22"/>
+        </w:rPr>
+        <w:t xml:space="preserve"> 패킷을 수신</w:t>
+      </w:r>
+      <w:r>
+        <w:rPr>
+          <w:rFonts w:hint="eastAsia"/>
+          <w:b/>
+          <w:bCs/>
+          <w:szCs w:val="22"/>
+        </w:rPr>
+        <w:t>합니다</w:t>
+      </w:r>
+      <w:r>
+        <w:rPr>
+          <w:b/>
+          <w:bCs/>
+          <w:szCs w:val="22"/>
+        </w:rPr>
+        <w:t xml:space="preserve">. 이때 </w:t>
+      </w:r>
+      <w:proofErr w:type="spellStart"/>
+      <w:r>
+        <w:rPr>
+          <w:b/>
+          <w:bCs/>
+          <w:szCs w:val="22"/>
+        </w:rPr>
+        <w:t>수신받은</w:t>
+      </w:r>
+      <w:proofErr w:type="spellEnd"/>
+      <w:r>
+        <w:rPr>
+          <w:b/>
+          <w:bCs/>
+          <w:szCs w:val="22"/>
+        </w:rPr>
+        <w:t xml:space="preserve"> 바이트 데이터와 상대방의 주소정보를 동시에 </w:t>
+      </w:r>
+      <w:proofErr w:type="spellStart"/>
+      <w:r>
+        <w:rPr>
+          <w:b/>
+          <w:bCs/>
+          <w:szCs w:val="22"/>
+        </w:rPr>
+        <w:t>반환받</w:t>
+      </w:r>
+      <w:r>
+        <w:rPr>
+          <w:rFonts w:hint="eastAsia"/>
+          <w:b/>
+          <w:bCs/>
+          <w:szCs w:val="22"/>
+        </w:rPr>
+        <w:t>습니</w:t>
+      </w:r>
+      <w:r>
+        <w:rPr>
+          <w:b/>
+          <w:bCs/>
+          <w:szCs w:val="22"/>
+        </w:rPr>
+        <w:t>다</w:t>
+      </w:r>
+      <w:proofErr w:type="spellEnd"/>
+      <w:r>
+        <w:rPr>
+          <w:b/>
+          <w:bCs/>
+          <w:szCs w:val="22"/>
+        </w:rPr>
+        <w:t>.</w:t>
+      </w:r>
+    </w:p>
+    <w:p>
+      <w:pPr>
+        <w:rPr>
+          <w:b/>
+          <w:bCs/>
+          <w:szCs w:val="22"/>
+        </w:rPr>
+      </w:pPr>
+    </w:p>
+    <w:p>
+      <w:pPr>
+        <w:rPr>
+          <w:b/>
+          <w:bCs/>
+          <w:szCs w:val="22"/>
+        </w:rPr>
+      </w:pPr>
+      <w:r>
+        <w:rPr>
+          <w:rFonts w:hint="eastAsia"/>
+          <w:b/>
+          <w:bCs/>
+          <w:szCs w:val="22"/>
+        </w:rPr>
+        <w:t xml:space="preserve">-수신 받은 데이터는 .decode()로 문자열반환후 출력하고, .upper()메서드로 소문자를 대문자로 반환한 메시지는 다시 .encode()과정을 거쳐서 바이트형태로 </w:t>
+      </w:r>
+      <w:proofErr w:type="spellStart"/>
+      <w:r>
+        <w:rPr>
+          <w:rFonts w:hint="eastAsia"/>
+          <w:b/>
+          <w:bCs/>
+          <w:szCs w:val="22"/>
+        </w:rPr>
+        <w:t>바꾼뒤</w:t>
+      </w:r>
+      <w:proofErr w:type="spellEnd"/>
+      <w:r>
+        <w:rPr>
+          <w:rFonts w:hint="eastAsia"/>
+          <w:b/>
+          <w:bCs/>
+          <w:szCs w:val="22"/>
+        </w:rPr>
+        <w:t xml:space="preserve">, </w:t>
+      </w:r>
+      <w:proofErr w:type="spellStart"/>
+      <w:r>
+        <w:rPr>
+          <w:rFonts w:hint="eastAsia"/>
+          <w:b/>
+          <w:bCs/>
+          <w:szCs w:val="22"/>
+        </w:rPr>
+        <w:t>sendto</w:t>
+      </w:r>
+      <w:proofErr w:type="spellEnd"/>
+      <w:r>
+        <w:rPr>
+          <w:rFonts w:hint="eastAsia"/>
+          <w:b/>
+          <w:bCs/>
+          <w:szCs w:val="22"/>
+        </w:rPr>
+        <w:t>()함수를 사용해 수신된 주소로 응답을 송신합니다.</w:t>
+      </w:r>
+    </w:p>
+    <w:p>
+      <w:pPr>
+        <w:rPr>
+          <w:b/>
+          <w:bCs/>
+          <w:szCs w:val="22"/>
+        </w:rPr>
+      </w:pPr>
+    </w:p>
+    <w:p>
+      <w:pPr>
+        <w:rPr>
+          <w:b/>
+          <w:bCs/>
+          <w:szCs w:val="22"/>
+        </w:rPr>
+      </w:pPr>
+    </w:p>
+    <w:p>
+      <w:pPr>
+        <w:rPr>
+          <w:b/>
+          <w:bCs/>
+          <w:szCs w:val="22"/>
+        </w:rPr>
+      </w:pPr>
+      <w:r>
+        <w:rPr>
+          <w:rFonts w:hint="eastAsia"/>
+          <w:b/>
+          <w:bCs/>
+          <w:szCs w:val="22"/>
+        </w:rPr>
+        <w:t>2-1.TCP_server.py 소스코드 제출</w:t>
+      </w:r>
+    </w:p>
+    <w:p>
+      <w:pPr>
+        <w:rPr>
+          <w:b/>
+          <w:bCs/>
+          <w:szCs w:val="22"/>
+        </w:rPr>
+      </w:pPr>
+      <w:r>
+        <w:rPr>
+          <w:b/>
+          <w:bCs/>
+          <w:szCs w:val="22"/>
+        </w:rPr>
+        <w:t>from socket import *</w:t>
+      </w:r>
+    </w:p>
+    <w:p>
+      <w:pPr>
+        <w:rPr>
+          <w:b/>
+          <w:bCs/>
+          <w:szCs w:val="22"/>
+        </w:rPr>
+      </w:pPr>
+    </w:p>
+    <w:p>
+      <w:pPr>
+        <w:rPr>
+          <w:b/>
+          <w:bCs/>
+          <w:szCs w:val="22"/>
+        </w:rPr>
+      </w:pPr>
+      <w:r>
+        <w:rPr>
+          <w:b/>
+          <w:bCs/>
+          <w:szCs w:val="22"/>
+        </w:rPr>
+        <w:t>student_id = "2371214"</w:t>
+      </w:r>
+    </w:p>
+    <w:p>
+      <w:pPr>
+        <w:rPr>
+          <w:rFonts w:hint="eastAsia"/>
+          <w:b/>
+          <w:bCs/>
+          <w:szCs w:val="22"/>
+        </w:rPr>
+      </w:pPr>
+      <w:r>
+        <w:rPr>
+          <w:b/>
+          <w:bCs/>
+          <w:szCs w:val="22"/>
+        </w:rPr>
+        <w:t>student_name = "이 지 형 "</w:t>
+      </w:r>
+    </w:p>
+    <w:p>
+      <w:pPr>
+        <w:rPr>
+          <w:b/>
+          <w:bCs/>
+          <w:szCs w:val="22"/>
+        </w:rPr>
+      </w:pPr>
+      <w:r>
+        <w:rPr>
+          <w:b/>
+          <w:bCs/>
+          <w:szCs w:val="22"/>
+        </w:rPr>
+        <w:t>serverPort = 12000</w:t>
+      </w:r>
+    </w:p>
+    <w:p>
+      <w:pPr>
+        <w:rPr>
+          <w:b/>
+          <w:bCs/>
+          <w:szCs w:val="22"/>
+        </w:rPr>
+      </w:pPr>
+    </w:p>
+    <w:p>
+      <w:pPr>
+        <w:rPr>
+          <w:b/>
+          <w:bCs/>
+          <w:szCs w:val="22"/>
+        </w:rPr>
+      </w:pPr>
+      <w:r>
+        <w:rPr>
+          <w:b/>
+          <w:bCs/>
+          <w:szCs w:val="22"/>
+        </w:rPr>
+        <w:t># TCP 소켓 생성 (SOCK_STREAM 사용)</w:t>
+      </w:r>
+    </w:p>
+    <w:p>
+      <w:pPr>
+        <w:rPr>
+          <w:b/>
+          <w:bCs/>
+          <w:szCs w:val="22"/>
+        </w:rPr>
+      </w:pPr>
+      <w:r>
+        <w:rPr>
+          <w:b/>
+          <w:bCs/>
+          <w:szCs w:val="22"/>
+        </w:rPr>
+        <w:t>serverSocket = socket(AF_INET, SOCK_STREAM)</w:t>
+      </w:r>
+    </w:p>
+    <w:p>
+      <w:pPr>
+        <w:rPr>
+          <w:rFonts w:hint="eastAsia"/>
+          <w:b/>
+          <w:bCs/>
+          <w:szCs w:val="22"/>
+        </w:rPr>
+      </w:pPr>
+      <w:r>
+        <w:rPr>
+          <w:b/>
+          <w:bCs/>
+          <w:szCs w:val="22"/>
+        </w:rPr>
+        <w:t>serverSocket.bind(('', serverPort))</w:t>
+      </w:r>
+    </w:p>
+    <w:p>
+      <w:pPr>
+        <w:rPr>
+          <w:rFonts w:hint="eastAsia"/>
+          <w:b/>
+          <w:bCs/>
+          <w:szCs w:val="22"/>
+        </w:rPr>
+      </w:pPr>
+      <w:r>
+        <w:rPr>
+          <w:b/>
+          <w:bCs/>
+          <w:szCs w:val="22"/>
+        </w:rPr>
+        <w:t># 클라이언트의 연결 요청 대기</w:t>
+      </w:r>
+    </w:p>
+    <w:p>
+      <w:pPr>
+        <w:rPr>
+          <w:rFonts w:hint="eastAsia"/>
+          <w:b/>
+          <w:bCs/>
+          <w:szCs w:val="22"/>
+        </w:rPr>
+      </w:pPr>
+      <w:proofErr w:type="spellStart"/>
+      <w:r>
+        <w:rPr>
+          <w:b/>
+          <w:bCs/>
+          <w:szCs w:val="22"/>
+        </w:rPr>
+        <w:t>serverSocket.listen</w:t>
+      </w:r>
+      <w:proofErr w:type="spellEnd"/>
+      <w:r>
+        <w:rPr>
+          <w:b/>
+          <w:bCs/>
+          <w:szCs w:val="22"/>
+        </w:rPr>
+        <w:t>(1)</w:t>
+      </w:r>
+    </w:p>
+    <w:p>
+      <w:pPr>
+        <w:rPr>
+          <w:b/>
+          <w:bCs/>
+          <w:szCs w:val="22"/>
+        </w:rPr>
+      </w:pPr>
+      <w:r>
+        <w:rPr>
+          <w:b/>
+          <w:bCs/>
+          <w:szCs w:val="22"/>
+        </w:rPr>
+        <w:t>print("==========================================")</w:t>
+      </w:r>
+    </w:p>
+    <w:p>
+      <w:pPr>
+        <w:rPr>
+          <w:b/>
+          <w:bCs/>
+          <w:szCs w:val="22"/>
+        </w:rPr>
+      </w:pPr>
+      <w:r>
+        <w:rPr>
+          <w:b/>
+          <w:bCs/>
+          <w:szCs w:val="22"/>
+        </w:rPr>
+        <w:t>print(f" TCP Server Started by [{student_id} {student_name}]")</w:t>
+      </w:r>
+    </w:p>
+    <w:p>
+      <w:pPr>
+        <w:rPr>
+          <w:b/>
+          <w:bCs/>
+          <w:szCs w:val="22"/>
+        </w:rPr>
+      </w:pPr>
+      <w:r>
+        <w:rPr>
+          <w:b/>
+          <w:bCs/>
+          <w:szCs w:val="22"/>
+        </w:rPr>
+        <w:t>print(f" The server is ready to receive (Port: {serverPort})")</w:t>
+      </w:r>
+    </w:p>
+    <w:p>
+      <w:pPr>
+        <w:rPr>
+          <w:b/>
+          <w:bCs/>
+          <w:szCs w:val="22"/>
+        </w:rPr>
+      </w:pPr>
+      <w:r>
+        <w:rPr>
+          <w:b/>
+          <w:bCs/>
+          <w:szCs w:val="22"/>
+        </w:rPr>
+        <w:t>print("==========================================\n")</w:t>
+      </w:r>
+    </w:p>
+    <w:p>
+      <w:pPr>
+        <w:rPr>
+          <w:b/>
+          <w:bCs/>
+          <w:szCs w:val="22"/>
+        </w:rPr>
+      </w:pPr>
+    </w:p>
+    <w:p>
+      <w:pPr>
+        <w:rPr>
+          <w:b/>
+          <w:bCs/>
+          <w:szCs w:val="22"/>
+        </w:rPr>
+      </w:pPr>
+      <w:r>
+        <w:rPr>
+          <w:b/>
+          <w:bCs/>
+          <w:szCs w:val="22"/>
+        </w:rPr>
+        <w:lastRenderedPageBreak/>
+        <w:t>while True:</w:t>
+      </w:r>
+    </w:p>
+    <w:p>
+      <w:pPr>
+        <w:rPr>
+          <w:b/>
+          <w:bCs/>
+          <w:szCs w:val="22"/>
+        </w:rPr>
+      </w:pPr>
+      <w:r>
+        <w:rPr>
+          <w:b/>
+          <w:bCs/>
+          <w:szCs w:val="22"/>
+        </w:rPr>
+        <w:t xml:space="preserve">    # 클라이언트의 연결 요청 수락 (전용 연결 소켓 생성)</w:t>
+      </w:r>
+    </w:p>
+    <w:p>
+      <w:pPr>
+        <w:rPr>
+          <w:rFonts w:hint="eastAsia"/>
+          <w:b/>
+          <w:bCs/>
+          <w:szCs w:val="22"/>
+        </w:rPr>
+      </w:pPr>
+      <w:r>
+        <w:rPr>
+          <w:b/>
+          <w:bCs/>
+          <w:szCs w:val="22"/>
+        </w:rPr>
+        <w:t xml:space="preserve">    </w:t>
+      </w:r>
+      <w:proofErr w:type="spellStart"/>
+      <w:r>
+        <w:rPr>
+          <w:b/>
+          <w:bCs/>
+          <w:szCs w:val="22"/>
+        </w:rPr>
+        <w:t>connectionSocket</w:t>
+      </w:r>
+      <w:proofErr w:type="spellEnd"/>
+      <w:r>
+        <w:rPr>
+          <w:b/>
+          <w:bCs/>
+          <w:szCs w:val="22"/>
+        </w:rPr>
+        <w:t xml:space="preserve">, </w:t>
+      </w:r>
+      <w:proofErr w:type="spellStart"/>
+      <w:r>
+        <w:rPr>
+          <w:b/>
+          <w:bCs/>
+          <w:szCs w:val="22"/>
+        </w:rPr>
+        <w:t>addr</w:t>
+      </w:r>
+      <w:proofErr w:type="spellEnd"/>
+      <w:r>
+        <w:rPr>
+          <w:b/>
+          <w:bCs/>
+          <w:szCs w:val="22"/>
+        </w:rPr>
+        <w:t xml:space="preserve"> = </w:t>
+      </w:r>
+      <w:proofErr w:type="spellStart"/>
+      <w:r>
+        <w:rPr>
+          <w:b/>
+          <w:bCs/>
+          <w:szCs w:val="22"/>
+        </w:rPr>
+        <w:t>serverSocket.accept</w:t>
+      </w:r>
+      <w:proofErr w:type="spellEnd"/>
+      <w:r>
+        <w:rPr>
+          <w:b/>
+          <w:bCs/>
+          <w:szCs w:val="22"/>
+        </w:rPr>
+        <w:t>()</w:t>
+      </w:r>
+    </w:p>
+    <w:p>
+      <w:pPr>
+        <w:rPr>
+          <w:rFonts w:hint="eastAsia"/>
+          <w:b/>
+          <w:bCs/>
+          <w:szCs w:val="22"/>
+        </w:rPr>
+      </w:pPr>
+      <w:r>
+        <w:rPr>
+          <w:b/>
+          <w:bCs/>
+          <w:szCs w:val="22"/>
+        </w:rPr>
+        <w:t xml:space="preserve">    sentence = </w:t>
+      </w:r>
+      <w:proofErr w:type="spellStart"/>
+      <w:r>
+        <w:rPr>
+          <w:b/>
+          <w:bCs/>
+          <w:szCs w:val="22"/>
+        </w:rPr>
+        <w:t>connectionSocket.recv</w:t>
+      </w:r>
+      <w:proofErr w:type="spellEnd"/>
+      <w:r>
+        <w:rPr>
+          <w:b/>
+          <w:bCs/>
+          <w:szCs w:val="22"/>
+        </w:rPr>
+        <w:t>(1024).decode()</w:t>
+      </w:r>
+    </w:p>
+    <w:p>
+      <w:pPr>
+        <w:rPr>
+          <w:b/>
+          <w:bCs/>
+          <w:szCs w:val="22"/>
+        </w:rPr>
+      </w:pPr>
+      <w:r>
+        <w:rPr>
+          <w:b/>
+          <w:bCs/>
+          <w:szCs w:val="22"/>
+        </w:rPr>
+        <w:t xml:space="preserve">    print(f"[Received from {</w:t>
+      </w:r>
+      <w:proofErr w:type="spellStart"/>
+      <w:r>
+        <w:rPr>
+          <w:b/>
+          <w:bCs/>
+          <w:szCs w:val="22"/>
+        </w:rPr>
+        <w:t>addr</w:t>
+      </w:r>
+      <w:proofErr w:type="spellEnd"/>
+      <w:r>
+        <w:rPr>
+          <w:b/>
+          <w:bCs/>
+          <w:szCs w:val="22"/>
+        </w:rPr>
+        <w:t>}]: {sentence}")</w:t>
+      </w:r>
+    </w:p>
+    <w:p>
+      <w:pPr>
+        <w:rPr>
+          <w:b/>
+          <w:bCs/>
+          <w:szCs w:val="22"/>
+        </w:rPr>
+      </w:pPr>
+      <w:r>
+        <w:rPr>
+          <w:b/>
+          <w:bCs/>
+          <w:szCs w:val="22"/>
+        </w:rPr>
+        <w:t xml:space="preserve">    </w:t>
+      </w:r>
+      <w:proofErr w:type="spellStart"/>
+      <w:r>
+        <w:rPr>
+          <w:b/>
+          <w:bCs/>
+          <w:szCs w:val="22"/>
+        </w:rPr>
+        <w:t>capitalizedSentence</w:t>
+      </w:r>
+      <w:proofErr w:type="spellEnd"/>
+      <w:r>
+        <w:rPr>
+          <w:b/>
+          <w:bCs/>
+          <w:szCs w:val="22"/>
+        </w:rPr>
+        <w:t xml:space="preserve"> = </w:t>
+      </w:r>
+      <w:proofErr w:type="spellStart"/>
+      <w:r>
+        <w:rPr>
+          <w:b/>
+          <w:bCs/>
+          <w:szCs w:val="22"/>
+        </w:rPr>
+        <w:t>sentence.upper</w:t>
+      </w:r>
+      <w:proofErr w:type="spellEnd"/>
+      <w:r>
+        <w:rPr>
+          <w:b/>
+          <w:bCs/>
+          <w:szCs w:val="22"/>
+        </w:rPr>
+        <w:t>()</w:t>
+      </w:r>
+    </w:p>
+    <w:p>
+      <w:pPr>
+        <w:rPr>
+          <w:b/>
+          <w:bCs/>
+          <w:szCs w:val="22"/>
+        </w:rPr>
+      </w:pPr>
+      <w:r>
+        <w:rPr>
+          <w:b/>
+          <w:bCs/>
+          <w:szCs w:val="22"/>
+        </w:rPr>
+        <w:t xml:space="preserve">    connectionSocket.send(capitalizedSentence.encode())</w:t>
+      </w:r>
+    </w:p>
+    <w:p>
+      <w:pPr>
+        <w:ind w:firstLineChars="200" w:firstLine="440"/>
+        <w:rPr>
+          <w:rFonts w:hint="eastAsia"/>
+          <w:b/>
+          <w:bCs/>
+          <w:szCs w:val="22"/>
+        </w:rPr>
+      </w:pPr>
+      <w:proofErr w:type="spellStart"/>
+      <w:r>
+        <w:rPr>
+          <w:b/>
+          <w:bCs/>
+          <w:szCs w:val="22"/>
+        </w:rPr>
+        <w:t>connectionSocket.close</w:t>
+      </w:r>
+      <w:proofErr w:type="spellEnd"/>
+      <w:r>
+        <w:rPr>
+          <w:b/>
+          <w:bCs/>
+          <w:szCs w:val="22"/>
+        </w:rPr>
+        <w:t>()</w:t>
+      </w:r>
+    </w:p>
+    <w:p>
+      <w:pPr>
+        <w:rPr>
+          <w:b/>
+          <w:bCs/>
+          <w:szCs w:val="22"/>
+        </w:rPr>
+      </w:pPr>
+      <w:r>
+        <w:rPr>
+          <w:b/>
+          <w:bCs/>
+          <w:szCs w:val="22"/>
+        </w:rPr>
+        <w:t xml:space="preserve"> </w:t>
+      </w:r>
+    </w:p>
+    <w:p>
+      <w:pPr>
+        <w:rPr>
+          <w:b/>
+          <w:bCs/>
+          <w:szCs w:val="22"/>
+        </w:rPr>
+      </w:pPr>
+    </w:p>
+    <w:p>
+      <w:pPr>
+        <w:rPr>
+          <w:b/>
+          <w:bCs/>
+          <w:szCs w:val="22"/>
+        </w:rPr>
+      </w:pPr>
+    </w:p>
+    <w:p>
+      <w:pPr>
+        <w:rPr>
+          <w:b/>
+          <w:bCs/>
+          <w:szCs w:val="22"/>
+        </w:rPr>
+      </w:pPr>
+      <w:r>
+        <w:rPr>
+          <w:rFonts w:hint="eastAsia"/>
+          <w:b/>
+          <w:bCs/>
+          <w:szCs w:val="22"/>
+        </w:rPr>
+        <w:t>2-2. TCP_client.py 소스코드 제출</w:t>
+      </w:r>
+    </w:p>
+    <w:p>
+      <w:pPr>
+        <w:rPr>
+          <w:b/>
+          <w:bCs/>
+          <w:szCs w:val="22"/>
+        </w:rPr>
+      </w:pPr>
+      <w:r>
+        <w:rPr>
+          <w:b/>
+          <w:bCs/>
+          <w:szCs w:val="22"/>
+        </w:rPr>
+        <w:t>from socket import *</w:t>
+      </w:r>
+    </w:p>
+    <w:p>
+      <w:pPr>
+        <w:rPr>
+          <w:b/>
+          <w:bCs/>
+          <w:szCs w:val="22"/>
+        </w:rPr>
+      </w:pPr>
+    </w:p>
+    <w:p>
+      <w:pPr>
+        <w:rPr>
+          <w:b/>
+          <w:bCs/>
+          <w:szCs w:val="22"/>
+        </w:rPr>
+      </w:pPr>
+      <w:r>
+        <w:rPr>
+          <w:b/>
+          <w:bCs/>
+          <w:szCs w:val="22"/>
+        </w:rPr>
+        <w:t>student_id = "2371214"</w:t>
+      </w:r>
+    </w:p>
+    <w:p>
+      <w:pPr>
+        <w:rPr>
+          <w:rFonts w:hint="eastAsia"/>
+          <w:b/>
+          <w:bCs/>
+          <w:szCs w:val="22"/>
+        </w:rPr>
+      </w:pPr>
+      <w:r>
+        <w:rPr>
+          <w:b/>
+          <w:bCs/>
+          <w:szCs w:val="22"/>
+        </w:rPr>
+        <w:t>student_name = "이 지 형 "</w:t>
+      </w:r>
+    </w:p>
+    <w:p>
+      <w:pPr>
+        <w:rPr>
+          <w:b/>
+          <w:bCs/>
+          <w:szCs w:val="22"/>
+        </w:rPr>
+      </w:pPr>
+      <w:r>
+        <w:rPr>
+          <w:b/>
+          <w:bCs/>
+          <w:szCs w:val="22"/>
+        </w:rPr>
+        <w:t>serverName = '127.0.0.1'</w:t>
+      </w:r>
+    </w:p>
+    <w:p>
+      <w:pPr>
+        <w:rPr>
+          <w:b/>
+          <w:bCs/>
+          <w:szCs w:val="22"/>
+        </w:rPr>
+      </w:pPr>
+      <w:r>
+        <w:rPr>
+          <w:b/>
+          <w:bCs/>
+          <w:szCs w:val="22"/>
+        </w:rPr>
+        <w:t>serverPort = 12000</w:t>
+      </w:r>
+    </w:p>
+    <w:p>
+      <w:pPr>
+        <w:rPr>
+          <w:b/>
+          <w:bCs/>
+          <w:szCs w:val="22"/>
+        </w:rPr>
+      </w:pPr>
+    </w:p>
+    <w:p>
+      <w:pPr>
+        <w:rPr>
+          <w:b/>
+          <w:bCs/>
+          <w:szCs w:val="22"/>
+        </w:rPr>
+      </w:pPr>
+      <w:r>
+        <w:rPr>
+          <w:b/>
+          <w:bCs/>
+          <w:szCs w:val="22"/>
+        </w:rPr>
+        <w:t>print("==========================================")</w:t>
+      </w:r>
+    </w:p>
+    <w:p>
+      <w:pPr>
+        <w:rPr>
+          <w:b/>
+          <w:bCs/>
+          <w:szCs w:val="22"/>
+        </w:rPr>
+      </w:pPr>
+      <w:r>
+        <w:rPr>
+          <w:b/>
+          <w:bCs/>
+          <w:szCs w:val="22"/>
+        </w:rPr>
+        <w:t>print(f" TCP Client Running [{student_id} {student_name}]")</w:t>
+      </w:r>
+    </w:p>
+    <w:p>
+      <w:pPr>
+        <w:rPr>
+          <w:b/>
+          <w:bCs/>
+          <w:szCs w:val="22"/>
+        </w:rPr>
+      </w:pPr>
+      <w:r>
+        <w:rPr>
+          <w:b/>
+          <w:bCs/>
+          <w:szCs w:val="22"/>
+        </w:rPr>
+        <w:t>print(" (종 료 하 려 면  'q' 또는  'exit'를  입 력 하 세 요 )")</w:t>
+      </w:r>
+    </w:p>
+    <w:p>
+      <w:pPr>
+        <w:rPr>
+          <w:b/>
+          <w:bCs/>
+          <w:szCs w:val="22"/>
+        </w:rPr>
+      </w:pPr>
+      <w:r>
+        <w:rPr>
+          <w:b/>
+          <w:bCs/>
+          <w:szCs w:val="22"/>
+        </w:rPr>
+        <w:t>print("==========================================\n")</w:t>
+      </w:r>
+    </w:p>
+    <w:p>
+      <w:pPr>
+        <w:rPr>
+          <w:b/>
+          <w:bCs/>
+          <w:szCs w:val="22"/>
+        </w:rPr>
+      </w:pPr>
+    </w:p>
+    <w:p>
+      <w:pPr>
+        <w:rPr>
+          <w:rFonts w:hint="eastAsia"/>
+          <w:b/>
+          <w:bCs/>
+          <w:szCs w:val="22"/>
+        </w:rPr>
+      </w:pPr>
+    </w:p>
+    <w:p>
+      <w:pPr>
+        <w:rPr>
+          <w:b/>
+          <w:bCs/>
+          <w:szCs w:val="22"/>
+        </w:rPr>
+      </w:pPr>
+      <w:r>
+        <w:rPr>
+          <w:b/>
+          <w:bCs/>
+          <w:szCs w:val="22"/>
+        </w:rPr>
+        <w:lastRenderedPageBreak/>
+        <w:t>while True:</w:t>
+      </w:r>
+    </w:p>
+    <w:p>
+      <w:pPr>
+        <w:rPr>
+          <w:rFonts w:hint="eastAsia"/>
+          <w:b/>
+          <w:bCs/>
+          <w:szCs w:val="22"/>
+        </w:rPr>
+      </w:pPr>
+      <w:r>
+        <w:rPr>
+          <w:b/>
+          <w:bCs/>
+          <w:szCs w:val="22"/>
+        </w:rPr>
+        <w:t xml:space="preserve">    sentence = input("Input lowercase sentence: ")</w:t>
+      </w:r>
+    </w:p>
+    <w:p>
+      <w:pPr>
+        <w:rPr>
+          <w:b/>
+          <w:bCs/>
+          <w:szCs w:val="22"/>
+        </w:rPr>
+      </w:pPr>
+      <w:r>
+        <w:rPr>
+          <w:b/>
+          <w:bCs/>
+          <w:szCs w:val="22"/>
+        </w:rPr>
+        <w:t xml:space="preserve">    if </w:t>
+      </w:r>
+      <w:proofErr w:type="spellStart"/>
+      <w:r>
+        <w:rPr>
+          <w:b/>
+          <w:bCs/>
+          <w:szCs w:val="22"/>
+        </w:rPr>
+        <w:t>sentence.lower</w:t>
+      </w:r>
+      <w:proofErr w:type="spellEnd"/>
+      <w:r>
+        <w:rPr>
+          <w:b/>
+          <w:bCs/>
+          <w:szCs w:val="22"/>
+        </w:rPr>
+        <w:t>() in ['q', 'exit']:</w:t>
+      </w:r>
+    </w:p>
+    <w:p>
+      <w:pPr>
+        <w:rPr>
+          <w:b/>
+          <w:bCs/>
+          <w:szCs w:val="22"/>
+        </w:rPr>
+      </w:pPr>
+      <w:r>
+        <w:rPr>
+          <w:b/>
+          <w:bCs/>
+          <w:szCs w:val="22"/>
+        </w:rPr>
+        <w:t xml:space="preserve">        print("\n[Client] 통 신 을  종 료 합 니 다 .")</w:t>
+      </w:r>
+    </w:p>
+    <w:p>
+      <w:pPr>
+        <w:rPr>
+          <w:b/>
+          <w:bCs/>
+          <w:szCs w:val="22"/>
+        </w:rPr>
+      </w:pPr>
+      <w:r>
+        <w:rPr>
+          <w:b/>
+          <w:bCs/>
+          <w:szCs w:val="22"/>
+        </w:rPr>
+        <w:t xml:space="preserve">        break</w:t>
+      </w:r>
+    </w:p>
+    <w:p>
+      <w:pPr>
+        <w:rPr>
+          <w:b/>
+          <w:bCs/>
+          <w:szCs w:val="22"/>
+        </w:rPr>
+      </w:pPr>
+    </w:p>
+    <w:p>
+      <w:pPr>
+        <w:rPr>
+          <w:b/>
+          <w:bCs/>
+          <w:szCs w:val="22"/>
+        </w:rPr>
+      </w:pPr>
+      <w:r>
+        <w:rPr>
+          <w:b/>
+          <w:bCs/>
+          <w:szCs w:val="22"/>
+        </w:rPr>
+        <w:t xml:space="preserve">    # TCP 소켓 생성 및 서버 연결</w:t>
+      </w:r>
+    </w:p>
+    <w:p>
+      <w:pPr>
+        <w:rPr>
+          <w:b/>
+          <w:bCs/>
+          <w:szCs w:val="22"/>
+        </w:rPr>
+      </w:pPr>
+      <w:r>
+        <w:rPr>
+          <w:b/>
+          <w:bCs/>
+          <w:szCs w:val="22"/>
+        </w:rPr>
+        <w:t xml:space="preserve">    clientSocket = socket(AF_INET, SOCK_STREAM)</w:t>
+      </w:r>
+    </w:p>
+    <w:p>
+      <w:pPr>
+        <w:rPr>
+          <w:b/>
+          <w:bCs/>
+          <w:szCs w:val="22"/>
+        </w:rPr>
+      </w:pPr>
+      <w:r>
+        <w:rPr>
+          <w:b/>
+          <w:bCs/>
+          <w:szCs w:val="22"/>
+        </w:rPr>
+        <w:t xml:space="preserve">    </w:t>
+      </w:r>
+      <w:proofErr w:type="spellStart"/>
+      <w:r>
+        <w:rPr>
+          <w:b/>
+          <w:bCs/>
+          <w:szCs w:val="22"/>
+        </w:rPr>
+        <w:t>clientSocket.connect</w:t>
+      </w:r>
+      <w:proofErr w:type="spellEnd"/>
+      <w:r>
+        <w:rPr>
+          <w:b/>
+          <w:bCs/>
+          <w:szCs w:val="22"/>
+        </w:rPr>
+        <w:t>((serverName, serverPort))</w:t>
+      </w:r>
+    </w:p>
+    <w:p>
+      <w:pPr>
+        <w:rPr>
+          <w:rFonts w:hint="eastAsia"/>
+          <w:b/>
+          <w:bCs/>
+          <w:szCs w:val="22"/>
+        </w:rPr>
+      </w:pPr>
+    </w:p>
+    <w:p>
+      <w:pPr>
+        <w:rPr>
+          <w:b/>
+          <w:bCs/>
+          <w:szCs w:val="22"/>
+        </w:rPr>
+      </w:pPr>
+      <w:r>
+        <w:rPr>
+          <w:b/>
+          <w:bCs/>
+          <w:szCs w:val="22"/>
+        </w:rPr>
+        <w:t xml:space="preserve">    </w:t>
+      </w:r>
+      <w:proofErr w:type="spellStart"/>
+      <w:r>
+        <w:rPr>
+          <w:b/>
+          <w:bCs/>
+          <w:szCs w:val="22"/>
+        </w:rPr>
+        <w:t>full_sentence</w:t>
+      </w:r>
+      <w:proofErr w:type="spellEnd"/>
+      <w:r>
+        <w:rPr>
+          <w:b/>
+          <w:bCs/>
+          <w:szCs w:val="22"/>
+        </w:rPr>
+        <w:t xml:space="preserve"> = f"[{student_id} {student_name}] {sentence}"</w:t>
+      </w:r>
+    </w:p>
+    <w:p>
+      <w:pPr>
+        <w:rPr>
+          <w:b/>
+          <w:bCs/>
+          <w:szCs w:val="22"/>
+        </w:rPr>
+      </w:pPr>
+      <w:r>
+        <w:rPr>
+          <w:b/>
+          <w:bCs/>
+          <w:szCs w:val="22"/>
+        </w:rPr>
+        <w:t xml:space="preserve">    </w:t>
+      </w:r>
+      <w:proofErr w:type="spellStart"/>
+      <w:r>
+        <w:rPr>
+          <w:b/>
+          <w:bCs/>
+          <w:szCs w:val="22"/>
+        </w:rPr>
+        <w:t>clientSocket.send</w:t>
+      </w:r>
+      <w:proofErr w:type="spellEnd"/>
+      <w:r>
+        <w:rPr>
+          <w:b/>
+          <w:bCs/>
+          <w:szCs w:val="22"/>
+        </w:rPr>
+        <w:t>(</w:t>
+      </w:r>
+      <w:proofErr w:type="spellStart"/>
+      <w:r>
+        <w:rPr>
+          <w:b/>
+          <w:bCs/>
+          <w:szCs w:val="22"/>
+        </w:rPr>
+        <w:t>full_sentence.encode</w:t>
+      </w:r>
+      <w:proofErr w:type="spellEnd"/>
+      <w:r>
+        <w:rPr>
+          <w:b/>
+          <w:bCs/>
+          <w:szCs w:val="22"/>
+        </w:rPr>
+        <w:t>())</w:t>
+      </w:r>
+    </w:p>
+    <w:p>
+      <w:pPr>
+        <w:rPr>
+          <w:b/>
+          <w:bCs/>
+          <w:szCs w:val="22"/>
+        </w:rPr>
+      </w:pPr>
+    </w:p>
+    <w:p>
+      <w:pPr>
+        <w:rPr>
+          <w:b/>
+          <w:bCs/>
+          <w:szCs w:val="22"/>
+        </w:rPr>
+      </w:pPr>
+      <w:r>
+        <w:rPr>
+          <w:b/>
+          <w:bCs/>
+          <w:szCs w:val="22"/>
+        </w:rPr>
+        <w:t xml:space="preserve">    # 서버 응답 수신</w:t>
+      </w:r>
+    </w:p>
+    <w:p>
+      <w:pPr>
+        <w:rPr>
+          <w:rFonts w:hint="eastAsia"/>
+          <w:b/>
+          <w:bCs/>
+          <w:szCs w:val="22"/>
+        </w:rPr>
+      </w:pPr>
+      <w:r>
+        <w:rPr>
+          <w:b/>
+          <w:bCs/>
+          <w:szCs w:val="22"/>
+        </w:rPr>
+        <w:t xml:space="preserve">    </w:t>
+      </w:r>
+      <w:proofErr w:type="spellStart"/>
+      <w:r>
+        <w:rPr>
+          <w:b/>
+          <w:bCs/>
+          <w:szCs w:val="22"/>
+        </w:rPr>
+        <w:t>modifiedSentence</w:t>
+      </w:r>
+      <w:proofErr w:type="spellEnd"/>
+      <w:r>
+        <w:rPr>
+          <w:b/>
+          <w:bCs/>
+          <w:szCs w:val="22"/>
+        </w:rPr>
+        <w:t xml:space="preserve"> = </w:t>
+      </w:r>
+      <w:proofErr w:type="spellStart"/>
+      <w:r>
+        <w:rPr>
+          <w:b/>
+          <w:bCs/>
+          <w:szCs w:val="22"/>
+        </w:rPr>
+        <w:t>clientSocket.recv</w:t>
+      </w:r>
+      <w:proofErr w:type="spellEnd"/>
+      <w:r>
+        <w:rPr>
+          <w:b/>
+          <w:bCs/>
+          <w:szCs w:val="22"/>
+        </w:rPr>
+        <w:t>(1024)</w:t>
+      </w:r>
+    </w:p>
+    <w:p>
+      <w:pPr>
+        <w:rPr>
+          <w:rFonts w:hint="eastAsia"/>
+          <w:b/>
+          <w:bCs/>
+          <w:szCs w:val="22"/>
+        </w:rPr>
+      </w:pPr>
+      <w:r>
+        <w:rPr>
+          <w:b/>
+          <w:bCs/>
+          <w:szCs w:val="22"/>
+        </w:rPr>
+        <w:t xml:space="preserve">    print(f"From Server: {</w:t>
+      </w:r>
+      <w:proofErr w:type="spellStart"/>
+      <w:r>
+        <w:rPr>
+          <w:b/>
+          <w:bCs/>
+          <w:szCs w:val="22"/>
+        </w:rPr>
+        <w:t>modifiedSentence.decode</w:t>
+      </w:r>
+      <w:proofErr w:type="spellEnd"/>
+      <w:r>
+        <w:rPr>
+          <w:b/>
+          <w:bCs/>
+          <w:szCs w:val="22"/>
+        </w:rPr>
+        <w:t>()}\n")</w:t>
+      </w:r>
+    </w:p>
+    <w:p>
+      <w:pPr>
+        <w:rPr>
+          <w:rFonts w:hint="eastAsia"/>
+          <w:b/>
+          <w:bCs/>
+          <w:szCs w:val="22"/>
+        </w:rPr>
+      </w:pPr>
+      <w:r>
+        <w:rPr>
+          <w:b/>
+          <w:bCs/>
+          <w:szCs w:val="22"/>
+        </w:rPr>
+        <w:t xml:space="preserve">    clientSocket.close()</w:t>
+      </w:r>
+    </w:p>
+    <w:p>
+      <w:pPr>
+        <w:rPr>
+          <w:b/>
+          <w:bCs/>
+          <w:szCs w:val="22"/>
+        </w:rPr>
+      </w:pPr>
+    </w:p>
+    <w:p>
+      <w:pPr>
+        <w:rPr>
+          <w:b/>
+          <w:bCs/>
+          <w:szCs w:val="22"/>
+        </w:rPr>
+      </w:pPr>
+    </w:p>
+    <w:p>
+      <w:pPr>
+        <w:rPr>
+          <w:b/>
+          <w:bCs/>
+          <w:szCs w:val="22"/>
+        </w:rPr>
+      </w:pPr>
+    </w:p>
+    <w:p>
+      <w:pPr>
+        <w:rPr>
+          <w:b/>
+          <w:bCs/>
+          <w:szCs w:val="22"/>
+        </w:rPr>
+      </w:pPr>
+    </w:p>
+    <w:p>
+      <w:pPr>
+        <w:rPr>
+          <w:b/>
+          <w:bCs/>
+          <w:szCs w:val="22"/>
+        </w:rPr>
+      </w:pPr>
+    </w:p>
+    <w:p>
+      <w:pPr>
+        <w:rPr>
+          <w:b/>
+          <w:bCs/>
+          <w:szCs w:val="22"/>
+        </w:rPr>
+      </w:pPr>
+    </w:p>
+    <w:p>
+      <w:pPr>
+        <w:rPr>
+          <w:rFonts w:hint="eastAsia"/>
+          <w:b/>
+          <w:bCs/>
+          <w:szCs w:val="22"/>
+        </w:rPr>
+      </w:pPr>
+    </w:p>
+    <w:p>
+      <w:pPr>
+        <w:rPr>
+          <w:b/>
+          <w:bCs/>
+          <w:szCs w:val="22"/>
+        </w:rPr>
+      </w:pPr>
+    </w:p>
+    <w:p>
+      <w:pPr>
+        <w:rPr>
+          <w:b/>
+          <w:bCs/>
+          <w:szCs w:val="22"/>
+        </w:rPr>
+      </w:pPr>
+      <w:r>
+        <w:rPr>
+          <w:rFonts w:hint="eastAsia"/>
+          <w:b/>
+          <w:bCs/>
+          <w:szCs w:val="22"/>
+        </w:rPr>
+        <w:lastRenderedPageBreak/>
+        <w:t>2</w:t>
+      </w:r>
+      <w:r>
+        <w:rPr>
+          <w:rFonts w:hint="eastAsia"/>
+          <w:b/>
+          <w:bCs/>
+          <w:szCs w:val="22"/>
+        </w:rPr>
+        <w:t xml:space="preserve">-3. </w:t>
+      </w:r>
+      <w:r>
+        <w:rPr>
+          <w:rFonts w:hint="eastAsia"/>
+          <w:b/>
+          <w:bCs/>
+          <w:szCs w:val="22"/>
+        </w:rPr>
+        <w:t>TCP</w:t>
+      </w:r>
+      <w:r>
+        <w:rPr>
+          <w:rFonts w:hint="eastAsia"/>
+          <w:b/>
+          <w:bCs/>
+          <w:szCs w:val="22"/>
+        </w:rPr>
+        <w:t xml:space="preserve"> client-server프로그램 실행결과</w:t>
+      </w:r>
+    </w:p>
+    <w:p>
+      <w:pPr>
+        <w:rPr>
+          <w:b/>
+          <w:bCs/>
+          <w:szCs w:val="22"/>
+        </w:rPr>
+      </w:pPr>
+      <w:r>
+        <w:rPr>
+          <w:b/>
+          <w:bCs/>
+          <w:szCs w:val="22"/>
+        </w:rPr>
+        <w:drawing>
+          <wp:inline distT="0" distB="0" distL="0" distR="0" wp14:anchorId="13F3FDEE" wp14:editId="2D8D1628">
+            <wp:extent cx="5731510" cy="3244215"/>
+            <wp:effectExtent l="0" t="0" r="2540" b="0"/>
+            <wp:docPr id="1884435902" name="그림 1"/>
+            <wp:cNvGraphicFramePr>
+              <a:graphicFrameLocks xmlns:a="http://schemas.openxmlformats.org/drawingml/2006/main" noChangeAspect="1"/>
+            </wp:cNvGraphicFramePr>
+            <a:graphic xmlns:a="http://schemas.openxmlformats.org/drawingml/2006/main">
+              <a:graphicData uri="http://schemas.openxmlformats.org/drawingml/2006/picture">
+                <pic:pic xmlns:pic="http://schemas.openxmlformats.org/drawingml/2006/picture">
+                  <pic:nvPicPr>
+                    <pic:cNvPr id="1884435902" name=""/>
+                    <pic:cNvPicPr/>
+                  </pic:nvPicPr>
+                  <pic:blipFill>
+                    <a:blip r:embed="rId7"/>
+                    <a:stretch>
+                      <a:fillRect/>
+                    </a:stretch>
+                  </pic:blipFill>
+                  <pic:spPr>
+                    <a:xfrm>
+                      <a:off x="0" y="0"/>
+                      <a:ext cx="5731510" cy="3244215"/>
+                    </a:xfrm>
+                    <a:prstGeom prst="rect">
+                      <a:avLst/>
+                    </a:prstGeom>
+                  </pic:spPr>
+                </pic:pic>
+              </a:graphicData>
+            </a:graphic>
+          </wp:inline>
+        </w:drawing>
+      </w:r>
+    </w:p>
+    <w:p>
+      <w:pPr>
+        <w:rPr>
+          <w:b/>
+          <w:bCs/>
+          <w:szCs w:val="22"/>
+        </w:rPr>
+      </w:pPr>
+      <w:r>
+        <w:rPr>
+          <w:b/>
+          <w:bCs/>
+          <w:szCs w:val="22"/>
+        </w:rPr>
+        <w:drawing>
+          <wp:inline distT="0" distB="0" distL="0" distR="0" wp14:anchorId="5E88D9A4" wp14:editId="1A85415C">
+            <wp:extent cx="5731510" cy="1633855"/>
+            <wp:effectExtent l="0" t="0" r="2540" b="4445"/>
+            <wp:docPr id="253523410" name="그림 1"/>
+            <wp:cNvGraphicFramePr>
+              <a:graphicFrameLocks xmlns:a="http://schemas.openxmlformats.org/drawingml/2006/main" noChangeAspect="1"/>
+            </wp:cNvGraphicFramePr>
+            <a:graphic xmlns:a="http://schemas.openxmlformats.org/drawingml/2006/main">
+              <a:graphicData uri="http://schemas.openxmlformats.org/drawingml/2006/picture">
+                <pic:pic xmlns:pic="http://schemas.openxmlformats.org/drawingml/2006/picture">
+                  <pic:nvPicPr>
+                    <pic:cNvPr id="253523410" name=""/>
+                    <pic:cNvPicPr/>
+                  </pic:nvPicPr>
+                  <pic:blipFill>
+                    <a:blip r:embed="rId8"/>
+                    <a:stretch>
+                      <a:fillRect/>
+                    </a:stretch>
+                  </pic:blipFill>
+                  <pic:spPr>
+                    <a:xfrm>
+                      <a:off x="0" y="0"/>
+                      <a:ext cx="5731510" cy="1633855"/>
+                    </a:xfrm>
+                    <a:prstGeom prst="rect">
+                      <a:avLst/>
+                    </a:prstGeom>
+                  </pic:spPr>
+                </pic:pic>
+              </a:graphicData>
+            </a:graphic>
+          </wp:inline>
+        </w:drawing>
+      </w:r>
+    </w:p>
+    <w:p>
+      <w:pPr>
+        <w:rPr>
+          <w:b/>
+          <w:bCs/>
+          <w:szCs w:val="22"/>
+        </w:rPr>
+      </w:pPr>
+    </w:p>
+    <w:p>
+      <w:pPr>
+        <w:rPr>
+          <w:b/>
+          <w:bCs/>
+          <w:szCs w:val="22"/>
+        </w:rPr>
+      </w:pPr>
+      <w:r>
+        <w:rPr>
+          <w:rFonts w:hint="eastAsia"/>
+          <w:b/>
+          <w:bCs/>
+          <w:szCs w:val="22"/>
+        </w:rPr>
+        <w:t>2</w:t>
+      </w:r>
+      <w:r>
+        <w:rPr>
+          <w:rFonts w:hint="eastAsia"/>
+          <w:b/>
+          <w:bCs/>
+          <w:szCs w:val="22"/>
+        </w:rPr>
+        <w:t>-4.</w:t>
+      </w:r>
+      <w:r>
+        <w:rPr>
+          <w:rFonts w:hint="eastAsia"/>
+          <w:b/>
+          <w:bCs/>
+          <w:szCs w:val="22"/>
+        </w:rPr>
+        <w:t>TCP</w:t>
+      </w:r>
+      <w:r>
+        <w:rPr>
+          <w:rFonts w:hint="eastAsia"/>
+          <w:b/>
+          <w:bCs/>
+          <w:szCs w:val="22"/>
+        </w:rPr>
+        <w:t>프로그램 설명</w:t>
+      </w:r>
+    </w:p>
+    <w:p>
+      <w:pPr>
+        <w:rPr>
+          <w:b/>
+          <w:bCs/>
+          <w:szCs w:val="22"/>
+        </w:rPr>
+      </w:pPr>
+      <w:r>
+        <w:rPr>
+          <w:rFonts w:hint="eastAsia"/>
+          <w:b/>
+          <w:bCs/>
+          <w:szCs w:val="22"/>
+        </w:rPr>
+        <w:t>-</w:t>
+      </w:r>
+      <w:r>
+        <w:rPr>
+          <w:b/>
+          <w:bCs/>
+          <w:szCs w:val="22"/>
+        </w:rPr>
+        <w:t>TCP는 UDP와 달리 통신 전 3-Way Handshake 과정을 거쳐 가상 연결을 설정하는 연결 지향형(Connection-oriented) 프로토콜</w:t>
+      </w:r>
+      <w:r>
+        <w:rPr>
+          <w:rFonts w:hint="eastAsia"/>
+          <w:b/>
+          <w:bCs/>
+          <w:szCs w:val="22"/>
+        </w:rPr>
+        <w:t>로서,</w:t>
+      </w:r>
+      <w:r>
+        <w:rPr>
+          <w:b/>
+          <w:bCs/>
+          <w:szCs w:val="22"/>
+        </w:rPr>
+        <w:t xml:space="preserve"> 데이터 전송의 신뢰성, 순서 보장, 흐름 제어 및 혼잡 제어를 제공하는 특징을 </w:t>
+      </w:r>
+      <w:proofErr w:type="gramStart"/>
+      <w:r>
+        <w:rPr>
+          <w:b/>
+          <w:bCs/>
+          <w:szCs w:val="22"/>
+        </w:rPr>
+        <w:t>가</w:t>
+      </w:r>
+      <w:r>
+        <w:rPr>
+          <w:rFonts w:hint="eastAsia"/>
+          <w:b/>
+          <w:bCs/>
+          <w:szCs w:val="22"/>
+        </w:rPr>
+        <w:t>집니다.</w:t>
+      </w:r>
+      <w:r>
+        <w:rPr>
+          <w:b/>
+          <w:bCs/>
+          <w:szCs w:val="22"/>
+        </w:rPr>
+        <w:t>.</w:t>
+      </w:r>
+      <w:proofErr w:type="gramEnd"/>
+      <w:r>
+        <w:rPr>
+          <w:b/>
+          <w:bCs/>
+          <w:szCs w:val="22"/>
+        </w:rPr>
+        <w:t xml:space="preserve"> </w:t>
+      </w:r>
+      <w:r>
+        <w:rPr>
+          <w:rFonts w:hint="eastAsia"/>
+          <w:b/>
+          <w:bCs/>
+          <w:szCs w:val="22"/>
+        </w:rPr>
+        <w:t>해당 TCP과제는 강의자료 2장-7절PDF내용을 참고하여</w:t>
+      </w:r>
+      <w:r>
+        <w:rPr>
+          <w:b/>
+          <w:bCs/>
+          <w:szCs w:val="22"/>
+        </w:rPr>
+        <w:t xml:space="preserve"> 클라이언트가 입력한 소문자 문자열을 서버로 전송하면, 서버가 이를 대문자로 변환하여 클라이언트에게 다시 반환하도록 설계</w:t>
+      </w:r>
+      <w:r>
+        <w:rPr>
+          <w:rFonts w:hint="eastAsia"/>
+          <w:b/>
+          <w:bCs/>
+          <w:szCs w:val="22"/>
+        </w:rPr>
+        <w:t>하였습니다</w:t>
+      </w:r>
+      <w:r>
+        <w:rPr>
+          <w:b/>
+          <w:bCs/>
+          <w:szCs w:val="22"/>
+        </w:rPr>
+        <w:t>.</w:t>
+      </w:r>
+    </w:p>
+    <w:p>
+      <w:pPr>
+        <w:rPr>
+          <w:b/>
+          <w:bCs/>
+          <w:szCs w:val="22"/>
+        </w:rPr>
+      </w:pPr>
+    </w:p>
+    <w:p>
+      <w:pPr>
+        <w:rPr>
+          <w:b/>
+          <w:bCs/>
+          <w:szCs w:val="22"/>
+        </w:rPr>
+      </w:pPr>
+      <w:r>
+        <w:rPr>
+          <w:rFonts w:hint="eastAsia"/>
+          <w:b/>
+          <w:bCs/>
+          <w:szCs w:val="22"/>
+        </w:rPr>
+        <w:t>-</w:t>
+      </w:r>
+      <w:r>
+        <w:rPr>
+          <w:b/>
+          <w:bCs/>
+          <w:szCs w:val="22"/>
+        </w:rPr>
+        <w:t>socket(AF_INET, SOCK_STREAM)을 호출하여 IPv4 주소 체계와 TCP 스트림 프로토콜을 사용하는</w:t>
+      </w:r>
+      <w:r>
+        <w:rPr>
+          <w:rFonts w:hint="eastAsia"/>
+          <w:b/>
+          <w:bCs/>
+          <w:szCs w:val="22"/>
+        </w:rPr>
+        <w:t xml:space="preserve"> </w:t>
+      </w:r>
+      <w:r>
+        <w:rPr>
+          <w:b/>
+          <w:bCs/>
+          <w:szCs w:val="22"/>
+        </w:rPr>
+        <w:t>소켓을 생성</w:t>
+      </w:r>
+      <w:r>
+        <w:rPr>
+          <w:rFonts w:hint="eastAsia"/>
+          <w:b/>
+          <w:bCs/>
+          <w:szCs w:val="22"/>
+        </w:rPr>
+        <w:t>합니다</w:t>
+      </w:r>
+      <w:r>
+        <w:rPr>
+          <w:b/>
+          <w:bCs/>
+          <w:szCs w:val="22"/>
+        </w:rPr>
+        <w:t>.</w:t>
+      </w:r>
+    </w:p>
+    <w:p>
+      <w:pPr>
+        <w:rPr>
+          <w:b/>
+          <w:bCs/>
+          <w:szCs w:val="22"/>
+        </w:rPr>
+      </w:pPr>
+    </w:p>
+    <w:p>
+      <w:pPr>
+        <w:rPr>
+          <w:b/>
+          <w:bCs/>
+          <w:szCs w:val="22"/>
+        </w:rPr>
+      </w:pPr>
+      <w:r>
+        <w:rPr>
+          <w:rFonts w:hint="eastAsia"/>
+          <w:b/>
+          <w:bCs/>
+          <w:szCs w:val="22"/>
+        </w:rPr>
+        <w:lastRenderedPageBreak/>
+        <w:t>-</w:t>
+      </w:r>
+      <w:proofErr w:type="spellStart"/>
+      <w:r>
+        <w:rPr>
+          <w:b/>
+          <w:bCs/>
+          <w:szCs w:val="22"/>
+        </w:rPr>
+        <w:t>serverSocket.listen</w:t>
+      </w:r>
+      <w:proofErr w:type="spellEnd"/>
+      <w:r>
+        <w:rPr>
+          <w:b/>
+          <w:bCs/>
+          <w:szCs w:val="22"/>
+        </w:rPr>
+        <w:t>(1)을 실행하여 클라이언트의 TCP 연결 요청(SYN)을 받아들일 수 있는 대기 상태로 전환</w:t>
+      </w:r>
+      <w:r>
+        <w:rPr>
+          <w:rFonts w:hint="eastAsia"/>
+          <w:b/>
+          <w:bCs/>
+          <w:szCs w:val="22"/>
+        </w:rPr>
+        <w:t>합니다.</w:t>
+      </w:r>
+    </w:p>
+    <w:p>
+      <w:pPr>
+        <w:rPr>
+          <w:b/>
+          <w:bCs/>
+          <w:szCs w:val="22"/>
+        </w:rPr>
+      </w:pPr>
+    </w:p>
+    <w:p>
+      <w:pPr>
+        <w:rPr>
+          <w:b/>
+          <w:bCs/>
+          <w:szCs w:val="22"/>
+        </w:rPr>
+      </w:pPr>
+      <w:r>
+        <w:rPr>
+          <w:rFonts w:hint="eastAsia"/>
+          <w:b/>
+          <w:bCs/>
+          <w:szCs w:val="22"/>
+        </w:rPr>
+        <w:t>-</w:t>
+      </w:r>
+      <w:proofErr w:type="spellStart"/>
+      <w:r>
+        <w:rPr>
+          <w:b/>
+          <w:bCs/>
+          <w:szCs w:val="22"/>
+        </w:rPr>
+        <w:t>connectionSocket.recv</w:t>
+      </w:r>
+      <w:proofErr w:type="spellEnd"/>
+      <w:r>
+        <w:rPr>
+          <w:b/>
+          <w:bCs/>
+          <w:szCs w:val="22"/>
+        </w:rPr>
+        <w:t>(1024)</w:t>
+      </w:r>
+      <w:proofErr w:type="spellStart"/>
+      <w:r>
+        <w:rPr>
+          <w:b/>
+          <w:bCs/>
+          <w:szCs w:val="22"/>
+        </w:rPr>
+        <w:t>를</w:t>
+      </w:r>
+      <w:proofErr w:type="spellEnd"/>
+      <w:r>
+        <w:rPr>
+          <w:b/>
+          <w:bCs/>
+          <w:szCs w:val="22"/>
+        </w:rPr>
+        <w:t xml:space="preserve"> 통해 바이트 데이터를 수신하고 .decode()</w:t>
+      </w:r>
+      <w:r>
+        <w:rPr>
+          <w:rFonts w:hint="eastAsia"/>
+          <w:b/>
+          <w:bCs/>
+          <w:szCs w:val="22"/>
+        </w:rPr>
+        <w:t>로 디코딩을 한 후에</w:t>
+      </w:r>
+      <w:r>
+        <w:rPr>
+          <w:b/>
+          <w:bCs/>
+          <w:szCs w:val="22"/>
+        </w:rPr>
+        <w:t xml:space="preserve"> 터미널에 로그를 출력한다.</w:t>
+      </w:r>
+    </w:p>
+    <w:p>
+      <w:pPr>
+        <w:rPr>
+          <w:b/>
+          <w:bCs/>
+          <w:szCs w:val="22"/>
+        </w:rPr>
+      </w:pPr>
+      <w:r>
+        <w:rPr>
+          <w:rFonts w:hint="eastAsia"/>
+          <w:b/>
+          <w:bCs/>
+          <w:szCs w:val="22"/>
+        </w:rPr>
+        <w:t>-</w:t>
+      </w:r>
+      <w:r>
+        <w:rPr>
+          <w:b/>
+          <w:bCs/>
+          <w:szCs w:val="22"/>
+        </w:rPr>
+        <w:t>.upper() 메서드로 대문자로 변환된 문자열을 .encode()</w:t>
+      </w:r>
+      <w:r>
+        <w:rPr>
+          <w:rFonts w:hint="eastAsia"/>
+          <w:b/>
+          <w:bCs/>
+          <w:szCs w:val="22"/>
+        </w:rPr>
+        <w:t xml:space="preserve">로 </w:t>
+      </w:r>
+      <w:proofErr w:type="spellStart"/>
+      <w:r>
+        <w:rPr>
+          <w:rFonts w:hint="eastAsia"/>
+          <w:b/>
+          <w:bCs/>
+          <w:szCs w:val="22"/>
+        </w:rPr>
+        <w:t>인코딩과정을</w:t>
+      </w:r>
+      <w:proofErr w:type="spellEnd"/>
+      <w:r>
+        <w:rPr>
+          <w:b/>
+          <w:bCs/>
+          <w:szCs w:val="22"/>
+        </w:rPr>
+        <w:t xml:space="preserve"> 거쳐 </w:t>
+      </w:r>
+      <w:proofErr w:type="spellStart"/>
+      <w:r>
+        <w:rPr>
+          <w:b/>
+          <w:bCs/>
+          <w:szCs w:val="22"/>
+        </w:rPr>
+        <w:t>connectionSocket.send</w:t>
+      </w:r>
+      <w:proofErr w:type="spellEnd"/>
+      <w:r>
+        <w:rPr>
+          <w:b/>
+          <w:bCs/>
+          <w:szCs w:val="22"/>
+        </w:rPr>
+        <w:t>()로 클라이언트에 전송</w:t>
+      </w:r>
+      <w:r>
+        <w:rPr>
+          <w:rFonts w:hint="eastAsia"/>
+          <w:b/>
+          <w:bCs/>
+          <w:szCs w:val="22"/>
+        </w:rPr>
+        <w:t>합니다.</w:t>
+      </w:r>
+    </w:p>
+    <w:p>
+      <w:pPr>
+        <w:rPr>
+          <w:b/>
+          <w:bCs/>
+          <w:szCs w:val="22"/>
+        </w:rPr>
+      </w:pPr>
+    </w:p>
+    <w:p>
+      <w:pPr>
+        <w:rPr>
+          <w:rFonts w:hint="eastAsia"/>
+          <w:b/>
+          <w:bCs/>
+          <w:szCs w:val="22"/>
+        </w:rPr>
+      </w:pPr>
+      <w:r>
+        <w:rPr>
+          <w:rFonts w:hint="eastAsia"/>
+          <w:b/>
+          <w:bCs/>
+          <w:szCs w:val="22"/>
+        </w:rPr>
+        <w:t xml:space="preserve">-이번과제를 수행하면서 </w:t>
+      </w:r>
+      <w:r>
+        <w:rPr>
+          <w:b/>
+          <w:bCs/>
+          <w:szCs w:val="22"/>
+        </w:rPr>
+        <w:t xml:space="preserve">UDP와 다르게 사전 연결 과정(connect(), accept())이 반드시 필요하며, 데이터 송수신시 주소 정보를 매번 명시하지 않고 send()와 </w:t>
+      </w:r>
+      <w:proofErr w:type="spellStart"/>
+      <w:r>
+        <w:rPr>
+          <w:b/>
+          <w:bCs/>
+          <w:szCs w:val="22"/>
+        </w:rPr>
+        <w:t>recv</w:t>
+      </w:r>
+      <w:proofErr w:type="spellEnd"/>
+      <w:r>
+        <w:rPr>
+          <w:b/>
+          <w:bCs/>
+          <w:szCs w:val="22"/>
+        </w:rPr>
+        <w:t>() 함수를 통해 신뢰성 있는</w:t>
+      </w:r>
+      <w:r>
+        <w:rPr>
+          <w:rFonts w:hint="eastAsia"/>
+          <w:b/>
+          <w:bCs/>
+          <w:szCs w:val="22"/>
+        </w:rPr>
+        <w:t xml:space="preserve"> </w:t>
+      </w:r>
+      <w:r>
+        <w:rPr>
+          <w:b/>
+          <w:bCs/>
+          <w:szCs w:val="22"/>
+        </w:rPr>
+        <w:t xml:space="preserve">통신이 수행됨을 </w:t>
+      </w:r>
+      <w:proofErr w:type="spellStart"/>
+      <w:r>
+        <w:rPr>
+          <w:rFonts w:hint="eastAsia"/>
+          <w:b/>
+          <w:bCs/>
+          <w:szCs w:val="22"/>
+        </w:rPr>
+        <w:t>알수있었습니다</w:t>
+      </w:r>
+      <w:proofErr w:type="spellEnd"/>
+      <w:r>
+        <w:rPr>
+          <w:b/>
+          <w:bCs/>
+          <w:szCs w:val="22"/>
+        </w:rPr>
+        <w:t>.</w:t>
+      </w:r>
+    </w:p>
+    <w:p>
+      <w:pPr>
+        <w:rPr>
+          <w:b/>
+          <w:bCs/>
+          <w:szCs w:val="22"/>
+        </w:rPr>
+      </w:pPr>
+    </w:p>
+    <w:p>
+      <w:pPr>
+        <w:rPr>
+          <w:rFonts w:hint="eastAsia"/>
+          <w:b/>
+          <w:bCs/>
+          <w:szCs w:val="22"/>
+        </w:rPr>
+      </w:pPr>
+      <w:r>
+        <w:rPr>
+          <w:rFonts w:hint="eastAsia"/>
+          <w:b/>
+          <w:bCs/>
+          <w:szCs w:val="22"/>
+        </w:rPr>
+        <w:t xml:space="preserve">-과제참고문헌(AI TOOL): GOOGLE GEMINI PLUS </w:t>
+      </w:r>
+      <w:r>
+        <w:rPr>
+          <w:b/>
+          <w:bCs/>
+          <w:szCs w:val="22"/>
+        </w:rPr>
+        <w:t>–</w:t>
+      </w:r>
+      <w:r>
+        <w:rPr>
+          <w:rFonts w:hint="eastAsia"/>
+          <w:b/>
+          <w:bCs/>
+          <w:szCs w:val="22"/>
+        </w:rPr>
+        <w:t xml:space="preserve"> 3.6FLASH</w:t>
+      </w:r>
     </w:p>
     <w:sectPr>
       <w:pgSz w:w="11906" w:h="16838"/>
@@ -367,6 +3612,232 @@
 <file path=word/numbering.xml><?xml version="1.0" encoding="utf-8"?>
 <w:numbering xmlns:wpc="http://schemas.microsoft.com/office/word/2010/wordprocessingCanvas" xmlns:cx="http://schemas.microsoft.com/office/drawing/2014/chartex" xmlns:cx1="http://schemas.microsoft.com/office/drawing/2015/9/8/chartex" xmlns:cx2="http://schemas.microsoft.com/office/drawing/2015/10/21/chartex" xmlns:cx3="http://schemas.microsoft.com/office/drawing/2016/5/9/chartex" xmlns:cx4="http://schemas.microsoft.com/office/drawing/2016/5/10/chartex" xmlns:cx5="http://schemas.microsoft.com/office/drawing/2016/5/11/chartex" xmlns:cx6="http://schemas.microsoft.com/office/drawing/2016/5/12/chartex" xmlns:cx7="http://schemas.microsoft.com/office/drawing/2016/5/13/chartex" xmlns:cx8="http://schemas.microsoft.com/office/drawing/2016/5/14/chartex" xmlns:mc="http://schemas.openxmlformats.org/markup-compatibility/2006" xmlns:aink="http://schemas.microsoft.com/office/drawing/2016/ink" xmlns:am3d="http://schemas.microsoft.com/office/drawing/2017/model3d" xmlns:o="urn:schemas-microsoft-com:office:office" xmlns:oel="http://schemas.microsoft.com/office/2019/extlst" xmlns:r="http://schemas.openxmlformats.org/officeDocument/2006/relationships" xmlns:m="http://schemas.openxmlformats.org/officeDocument/2006/math" xmlns:v="urn:schemas-microsoft-com:vml" xmlns:wp14="http://schemas.microsoft.com/office/word/2010/wordprocessingDrawing" xmlns:wp="http://schemas.openxmlformats.org/drawingml/2006/wordprocessingDrawing" xmlns:w10="urn:schemas-microsoft-com:office:word" xmlns:w="http://schemas.openxmlformats.org/wordprocessingml/2006/main" xmlns:w14="http://schemas.microsoft.com/office/word/2010/wordml" xmlns:w15="http://schemas.microsoft.com/office/word/2012/wordml" xmlns:w16cex="http://schemas.microsoft.com/office/word/2018/wordml/cex" xmlns:w16cid="http://schemas.microsoft.com/office/word/2016/wordml/cid" xmlns:w16="http://schemas.microsoft.com/office/word/2018/wordml" xmlns:w16du="http://schemas.microsoft.com/office/word/2023/wordml/word16du" xmlns:w16sdtdh="http://schemas.microsoft.com/office/word/2020/wordml/sdtdatahash" xmlns:w16sdtfl="http://schemas.microsoft.com/office/word/2024/wordml/sdtformatlock" xmlns:w16se="http://schemas.microsoft.com/office/word/2015/wordml/symex" xmlns:wpg="http://schemas.microsoft.com/office/word/2010/wordprocessingGroup" xmlns:wpi="http://schemas.microsoft.com/office/word/2010/wordprocessingInk" xmlns:wne="http://schemas.microsoft.com/office/word/2006/wordml" xmlns:wps="http://schemas.microsoft.com/office/word/2010/wordprocessingShape" mc:Ignorable="w14 w15 w16se w16cid w16 w16cex w16sdtdh w16sdtfl w16du wp14">
   <w:abstractNum w:abstractNumId="0" w15:restartNumberingAfterBreak="0">
+    <w:nsid w:val="0EE80932"/>
+    <w:multiLevelType w:val="hybridMultilevel"/>
+    <w:tmpl w:val="65B67AE8"/>
+    <w:lvl w:ilvl="0" w:tplc="E5FC8016">
+      <w:start w:val="1"/>
+      <w:numFmt w:val="bullet"/>
+      <w:lvlText w:val="-"/>
+      <w:lvlJc w:val="left"/>
+      <w:pPr>
+        <w:ind w:left="800" w:hanging="360"/>
+      </w:pPr>
+      <w:rPr>
+        <w:rFonts w:ascii="맑은 고딕" w:eastAsia="맑은 고딕" w:hAnsi="맑은 고딕" w:cstheme="minorBidi" w:hint="eastAsia"/>
+      </w:rPr>
+    </w:lvl>
+    <w:lvl w:ilvl="1" w:tplc="04090003" w:tentative="1">
+      <w:start w:val="1"/>
+      <w:numFmt w:val="bullet"/>
+      <w:lvlText w:val=""/>
+      <w:lvlJc w:val="left"/>
+      <w:pPr>
+        <w:ind w:left="1320" w:hanging="440"/>
+      </w:pPr>
+      <w:rPr>
+        <w:rFonts w:ascii="Wingdings" w:hAnsi="Wingdings" w:hint="default"/>
+      </w:rPr>
+    </w:lvl>
+    <w:lvl w:ilvl="2" w:tplc="04090005" w:tentative="1">
+      <w:start w:val="1"/>
+      <w:numFmt w:val="bullet"/>
+      <w:lvlText w:val=""/>
+      <w:lvlJc w:val="left"/>
+      <w:pPr>
+        <w:ind w:left="1760" w:hanging="440"/>
+      </w:pPr>
+      <w:rPr>
+        <w:rFonts w:ascii="Wingdings" w:hAnsi="Wingdings" w:hint="default"/>
+      </w:rPr>
+    </w:lvl>
+    <w:lvl w:ilvl="3" w:tplc="04090001" w:tentative="1">
+      <w:start w:val="1"/>
+      <w:numFmt w:val="bullet"/>
+      <w:lvlText w:val=""/>
+      <w:lvlJc w:val="left"/>
+      <w:pPr>
+        <w:ind w:left="2200" w:hanging="440"/>
+      </w:pPr>
+      <w:rPr>
+        <w:rFonts w:ascii="Wingdings" w:hAnsi="Wingdings" w:hint="default"/>
+      </w:rPr>
+    </w:lvl>
+    <w:lvl w:ilvl="4" w:tplc="04090003" w:tentative="1">
+      <w:start w:val="1"/>
+      <w:numFmt w:val="bullet"/>
+      <w:lvlText w:val=""/>
+      <w:lvlJc w:val="left"/>
+      <w:pPr>
+        <w:ind w:left="2640" w:hanging="440"/>
+      </w:pPr>
+      <w:rPr>
+        <w:rFonts w:ascii="Wingdings" w:hAnsi="Wingdings" w:hint="default"/>
+      </w:rPr>
+    </w:lvl>
+    <w:lvl w:ilvl="5" w:tplc="04090005" w:tentative="1">
+      <w:start w:val="1"/>
+      <w:numFmt w:val="bullet"/>
+      <w:lvlText w:val=""/>
+      <w:lvlJc w:val="left"/>
+      <w:pPr>
+        <w:ind w:left="3080" w:hanging="440"/>
+      </w:pPr>
+      <w:rPr>
+        <w:rFonts w:ascii="Wingdings" w:hAnsi="Wingdings" w:hint="default"/>
+      </w:rPr>
+    </w:lvl>
+    <w:lvl w:ilvl="6" w:tplc="04090001" w:tentative="1">
+      <w:start w:val="1"/>
+      <w:numFmt w:val="bullet"/>
+      <w:lvlText w:val=""/>
+      <w:lvlJc w:val="left"/>
+      <w:pPr>
+        <w:ind w:left="3520" w:hanging="440"/>
+      </w:pPr>
+      <w:rPr>
+        <w:rFonts w:ascii="Wingdings" w:hAnsi="Wingdings" w:hint="default"/>
+      </w:rPr>
+    </w:lvl>
+    <w:lvl w:ilvl="7" w:tplc="04090003" w:tentative="1">
+      <w:start w:val="1"/>
+      <w:numFmt w:val="bullet"/>
+      <w:lvlText w:val=""/>
+      <w:lvlJc w:val="left"/>
+      <w:pPr>
+        <w:ind w:left="3960" w:hanging="440"/>
+      </w:pPr>
+      <w:rPr>
+        <w:rFonts w:ascii="Wingdings" w:hAnsi="Wingdings" w:hint="default"/>
+      </w:rPr>
+    </w:lvl>
+    <w:lvl w:ilvl="8" w:tplc="04090005" w:tentative="1">
+      <w:start w:val="1"/>
+      <w:numFmt w:val="bullet"/>
+      <w:lvlText w:val=""/>
+      <w:lvlJc w:val="left"/>
+      <w:pPr>
+        <w:ind w:left="4400" w:hanging="440"/>
+      </w:pPr>
+      <w:rPr>
+        <w:rFonts w:ascii="Wingdings" w:hAnsi="Wingdings" w:hint="default"/>
+      </w:rPr>
+    </w:lvl>
+  </w:abstractNum>
+  <w:abstractNum w:abstractNumId="1" w15:restartNumberingAfterBreak="0">
+    <w:nsid w:val="3FFB5387"/>
+    <w:multiLevelType w:val="hybridMultilevel"/>
+    <w:tmpl w:val="42B46FD4"/>
+    <w:lvl w:ilvl="0" w:tplc="319EDD16">
+      <w:start w:val="1"/>
+      <w:numFmt w:val="bullet"/>
+      <w:lvlText w:val="-"/>
+      <w:lvlJc w:val="left"/>
+      <w:pPr>
+        <w:ind w:left="800" w:hanging="360"/>
+      </w:pPr>
+      <w:rPr>
+        <w:rFonts w:ascii="맑은 고딕" w:eastAsia="맑은 고딕" w:hAnsi="맑은 고딕" w:cstheme="minorBidi" w:hint="eastAsia"/>
+      </w:rPr>
+    </w:lvl>
+    <w:lvl w:ilvl="1" w:tplc="04090003" w:tentative="1">
+      <w:start w:val="1"/>
+      <w:numFmt w:val="bullet"/>
+      <w:lvlText w:val=""/>
+      <w:lvlJc w:val="left"/>
+      <w:pPr>
+        <w:ind w:left="1320" w:hanging="440"/>
+      </w:pPr>
+      <w:rPr>
+        <w:rFonts w:ascii="Wingdings" w:hAnsi="Wingdings" w:hint="default"/>
+      </w:rPr>
+    </w:lvl>
+    <w:lvl w:ilvl="2" w:tplc="04090005" w:tentative="1">
+      <w:start w:val="1"/>
+      <w:numFmt w:val="bullet"/>
+      <w:lvlText w:val=""/>
+      <w:lvlJc w:val="left"/>
+      <w:pPr>
+        <w:ind w:left="1760" w:hanging="440"/>
+      </w:pPr>
+      <w:rPr>
+        <w:rFonts w:ascii="Wingdings" w:hAnsi="Wingdings" w:hint="default"/>
+      </w:rPr>
+    </w:lvl>
+    <w:lvl w:ilvl="3" w:tplc="04090001" w:tentative="1">
+      <w:start w:val="1"/>
+      <w:numFmt w:val="bullet"/>
+      <w:lvlText w:val=""/>
+      <w:lvlJc w:val="left"/>
+      <w:pPr>
+        <w:ind w:left="2200" w:hanging="440"/>
+      </w:pPr>
+      <w:rPr>
+        <w:rFonts w:ascii="Wingdings" w:hAnsi="Wingdings" w:hint="default"/>
+      </w:rPr>
+    </w:lvl>
+    <w:lvl w:ilvl="4" w:tplc="04090003" w:tentative="1">
+      <w:start w:val="1"/>
+      <w:numFmt w:val="bullet"/>
+      <w:lvlText w:val=""/>
+      <w:lvlJc w:val="left"/>
+      <w:pPr>
+        <w:ind w:left="2640" w:hanging="440"/>
+      </w:pPr>
+      <w:rPr>
+        <w:rFonts w:ascii="Wingdings" w:hAnsi="Wingdings" w:hint="default"/>
+      </w:rPr>
+    </w:lvl>
+    <w:lvl w:ilvl="5" w:tplc="04090005" w:tentative="1">
+      <w:start w:val="1"/>
+      <w:numFmt w:val="bullet"/>
+      <w:lvlText w:val=""/>
+      <w:lvlJc w:val="left"/>
+      <w:pPr>
+        <w:ind w:left="3080" w:hanging="440"/>
+      </w:pPr>
+      <w:rPr>
+        <w:rFonts w:ascii="Wingdings" w:hAnsi="Wingdings" w:hint="default"/>
+      </w:rPr>
+    </w:lvl>
+    <w:lvl w:ilvl="6" w:tplc="04090001" w:tentative="1">
+      <w:start w:val="1"/>
+      <w:numFmt w:val="bullet"/>
+      <w:lvlText w:val=""/>
+      <w:lvlJc w:val="left"/>
+      <w:pPr>
+        <w:ind w:left="3520" w:hanging="440"/>
+      </w:pPr>
+      <w:rPr>
+        <w:rFonts w:ascii="Wingdings" w:hAnsi="Wingdings" w:hint="default"/>
+      </w:rPr>
+    </w:lvl>
+    <w:lvl w:ilvl="7" w:tplc="04090003" w:tentative="1">
+      <w:start w:val="1"/>
+      <w:numFmt w:val="bullet"/>
+      <w:lvlText w:val=""/>
+      <w:lvlJc w:val="left"/>
+      <w:pPr>
+        <w:ind w:left="3960" w:hanging="440"/>
+      </w:pPr>
+      <w:rPr>
+        <w:rFonts w:ascii="Wingdings" w:hAnsi="Wingdings" w:hint="default"/>
+      </w:rPr>
+    </w:lvl>
+    <w:lvl w:ilvl="8" w:tplc="04090005" w:tentative="1">
+      <w:start w:val="1"/>
+      <w:numFmt w:val="bullet"/>
+      <w:lvlText w:val=""/>
+      <w:lvlJc w:val="left"/>
+      <w:pPr>
+        <w:ind w:left="4400" w:hanging="440"/>
+      </w:pPr>
+      <w:rPr>
+        <w:rFonts w:ascii="Wingdings" w:hAnsi="Wingdings" w:hint="default"/>
+      </w:rPr>
+    </w:lvl>
+  </w:abstractNum>
+  <w:abstractNum w:abstractNumId="2" w15:restartNumberingAfterBreak="0">
     <w:nsid w:val="6FE74BFC"/>
     <w:multiLevelType w:val="hybridMultilevel"/>
     <w:tmpl w:val="9E14FEF6"/>
@@ -456,6 +3927,12 @@
     </w:lvl>
   </w:abstractNum>
   <w:num w:numId="1" w16cid:durableId="775977495">
+    <w:abstractNumId w:val="2"/>
+  </w:num>
+  <w:num w:numId="2" w16cid:durableId="403841540">
+    <w:abstractNumId w:val="1"/>
+  </w:num>
+  <w:num w:numId="3" w16cid:durableId="2102144172">
     <w:abstractNumId w:val="0"/>
   </w:num>
 </w:numbering>
@@ -1376,6 +4853,18 @@
       <w:spacing w:val="5"/>
     </w:rPr>
   </w:style>
+  <w:style w:type="paragraph" w:styleId="aa">
+    <w:name w:val="Normal (Web)"/>
+    <w:basedOn w:val="a"/>
+    <w:uiPriority w:val="99"/>
+    <w:semiHidden/>
+    <w:unhideWhenUsed/>
+    <w:rsid w:val="00E21278"/>
+    <w:rPr>
+      <w:rFonts w:ascii="Times New Roman" w:hAnsi="Times New Roman" w:cs="Times New Roman"/>
+      <w:sz w:val="24"/>
+    </w:rPr>
+  </w:style>
 </w:styles>
 </file>
 

</xml_diff>